<commit_message>
nmv 01 10 2026
</commit_message>
<xml_diff>
--- a/TS-Kramam/TS-4.6/TS 4.6 Malayalam Krama Paatam Corrections.docx
+++ b/TS-Kramam/TS-4.6/TS 4.6 Malayalam Krama Paatam Corrections.docx
@@ -81,7 +81,18 @@
           <w:szCs w:val="32"/>
           <w:u w:val="single"/>
         </w:rPr>
-        <w:t xml:space="preserve">Observed till </w:t>
+        <w:t xml:space="preserve">Observed </w:t>
+      </w:r>
+      <w:proofErr w:type="gramStart"/>
+      <w:r>
+        <w:rPr>
+          <w:b/>
+          <w:bCs/>
+          <w:sz w:val="32"/>
+          <w:szCs w:val="32"/>
+          <w:u w:val="single"/>
+        </w:rPr>
+        <w:t xml:space="preserve">till </w:t>
       </w:r>
       <w:r>
         <w:rPr>
@@ -94,6 +105,7 @@
         </w:rPr>
         <w:t>????</w:t>
       </w:r>
+      <w:proofErr w:type="gramEnd"/>
     </w:p>
     <w:p>
       <w:pPr>
@@ -387,8 +399,9 @@
                 <w:szCs w:val="40"/>
                 <w:lang w:eastAsia="en-IN" w:bidi="ml-IN"/>
               </w:rPr>
-              <w:t>pW§ g—ª</w:t>
-            </w:r>
+              <w:t>pW§ g—</w:t>
+            </w:r>
+            <w:proofErr w:type="gramStart"/>
             <w:r>
               <w:rPr>
                 <w:rFonts w:ascii="BRH Malayalam Extra" w:eastAsia="Times New Roman" w:hAnsi="BRH Malayalam Extra" w:cs="BRH Malayalam Extra"/>
@@ -397,6 +410,16 @@
                 <w:szCs w:val="40"/>
                 <w:lang w:eastAsia="en-IN" w:bidi="ml-IN"/>
               </w:rPr>
+              <w:t>ª</w:t>
+            </w:r>
+            <w:r>
+              <w:rPr>
+                <w:rFonts w:ascii="BRH Malayalam Extra" w:eastAsia="Times New Roman" w:hAnsi="BRH Malayalam Extra" w:cs="BRH Malayalam Extra"/>
+                <w:color w:val="000000"/>
+                <w:sz w:val="40"/>
+                <w:szCs w:val="40"/>
+                <w:lang w:eastAsia="en-IN" w:bidi="ml-IN"/>
+              </w:rPr>
               <w:t>.</w:t>
             </w:r>
             <w:r>
@@ -409,6 +432,7 @@
               </w:rPr>
               <w:t>ty</w:t>
             </w:r>
+            <w:proofErr w:type="gramEnd"/>
             <w:r>
               <w:rPr>
                 <w:rFonts w:ascii="BRH Malayalam Extra" w:eastAsia="Times New Roman" w:hAnsi="BRH Malayalam Extra" w:cs="BRH Malayalam Extra"/>
@@ -756,7 +780,7 @@
                 <w:sz w:val="28"/>
                 <w:szCs w:val="32"/>
               </w:rPr>
-              <w:t>2.5</w:t>
+              <w:t>2.4</w:t>
             </w:r>
             <w:r>
               <w:rPr>
@@ -795,7 +819,7 @@
                 <w:szCs w:val="32"/>
                 <w:lang w:val="en-IN"/>
               </w:rPr>
-              <w:t>Krama Vaakyam No.– 28</w:t>
+              <w:t>Krama Vaakyam No.– 17</w:t>
             </w:r>
           </w:p>
           <w:p>
@@ -844,17 +868,7 @@
                 <w:szCs w:val="32"/>
                 <w:lang w:val="it-IT"/>
               </w:rPr>
-              <w:t>1</w:t>
-            </w:r>
-            <w:r>
-              <w:rPr>
-                <w:rFonts w:cs="Arial"/>
-                <w:b/>
-                <w:sz w:val="28"/>
-                <w:szCs w:val="32"/>
-                <w:lang w:val="it-IT"/>
-              </w:rPr>
-              <w:t>0</w:t>
+              <w:t>9</w:t>
             </w:r>
           </w:p>
         </w:tc>
@@ -883,115 +897,29 @@
                 <w:color w:val="000000"/>
                 <w:sz w:val="40"/>
                 <w:szCs w:val="40"/>
-                <w:lang w:val="it-IT" w:eastAsia="en-IN" w:bidi="ml-IN"/>
-              </w:rPr>
-              <w:t>A</w:t>
-            </w:r>
-            <w:r>
-              <w:rPr>
-                <w:rFonts w:ascii="BRH Malayalam Extra" w:eastAsia="Times New Roman" w:hAnsi="BRH Malayalam Extra" w:cs="BRH Malayalam Extra"/>
-                <w:color w:val="000000"/>
-                <w:sz w:val="32"/>
-                <w:szCs w:val="40"/>
-                <w:lang w:val="it-IT" w:eastAsia="en-IN" w:bidi="ml-IN"/>
-              </w:rPr>
-              <w:t>–</w:t>
-            </w:r>
-            <w:r>
-              <w:rPr>
-                <w:rFonts w:ascii="BRH Malayalam Extra" w:eastAsia="Times New Roman" w:hAnsi="BRH Malayalam Extra" w:cs="BRH Malayalam Extra"/>
-                <w:color w:val="000000"/>
-                <w:sz w:val="40"/>
-                <w:szCs w:val="40"/>
-                <w:lang w:val="it-IT" w:eastAsia="en-IN" w:bidi="ml-IN"/>
-              </w:rPr>
-              <w:t>ÆõZy—rç</w:t>
-            </w:r>
-            <w:r>
-              <w:rPr>
-                <w:rFonts w:ascii="BRH Malayalam Extra" w:eastAsia="Times New Roman" w:hAnsi="BRH Malayalam Extra" w:cs="BRH Malayalam Extra"/>
-                <w:color w:val="000000"/>
-                <w:sz w:val="32"/>
-                <w:szCs w:val="40"/>
-                <w:lang w:val="it-IT" w:eastAsia="en-IN" w:bidi="ml-IN"/>
-              </w:rPr>
-              <w:t>–</w:t>
-            </w:r>
-            <w:r>
-              <w:rPr>
-                <w:rFonts w:ascii="BRH Malayalam Extra" w:eastAsia="Times New Roman" w:hAnsi="BRH Malayalam Extra" w:cs="BRH Malayalam Extra"/>
-                <w:color w:val="000000"/>
-                <w:sz w:val="40"/>
-                <w:szCs w:val="40"/>
-                <w:lang w:val="it-IT" w:eastAsia="en-IN" w:bidi="ml-IN"/>
-              </w:rPr>
-              <w:t xml:space="preserve">b§ h¡p—dxdy | </w:t>
-            </w:r>
-          </w:p>
-          <w:p>
-            <w:pPr>
-              <w:widowControl w:val="0"/>
-              <w:autoSpaceDE w:val="0"/>
-              <w:autoSpaceDN w:val="0"/>
-              <w:adjustRightInd w:val="0"/>
-              <w:spacing w:before="0" w:line="240" w:lineRule="auto"/>
-              <w:rPr>
-                <w:rFonts w:ascii="BRH Malayalam Extra" w:eastAsia="Times New Roman" w:hAnsi="BRH Malayalam Extra" w:cs="BRH Malayalam Extra"/>
-                <w:color w:val="000000"/>
-                <w:sz w:val="40"/>
-                <w:szCs w:val="40"/>
-                <w:lang w:val="en-IN" w:eastAsia="en-IN" w:bidi="ml-IN"/>
-              </w:rPr>
-            </w:pPr>
-            <w:r>
-              <w:rPr>
-                <w:rFonts w:ascii="BRH Malayalam Extra" w:eastAsia="Times New Roman" w:hAnsi="BRH Malayalam Extra" w:cs="BRH Malayalam Extra"/>
-                <w:color w:val="000000"/>
-                <w:sz w:val="40"/>
-                <w:szCs w:val="40"/>
-                <w:lang w:val="en-IN" w:eastAsia="en-IN" w:bidi="ml-IN"/>
-              </w:rPr>
-              <w:t>A</w:t>
-            </w:r>
-            <w:r>
-              <w:rPr>
-                <w:rFonts w:ascii="BRH Malayalam Extra" w:eastAsia="Times New Roman" w:hAnsi="BRH Malayalam Extra" w:cs="BRH Malayalam Extra"/>
-                <w:color w:val="000000"/>
-                <w:sz w:val="32"/>
-                <w:szCs w:val="40"/>
-                <w:lang w:val="en-IN" w:eastAsia="en-IN" w:bidi="ml-IN"/>
-              </w:rPr>
-              <w:t>–</w:t>
-            </w:r>
-            <w:r>
-              <w:rPr>
-                <w:rFonts w:ascii="BRH Malayalam Extra" w:eastAsia="Times New Roman" w:hAnsi="BRH Malayalam Extra" w:cs="BRH Malayalam Extra"/>
-                <w:color w:val="000000"/>
-                <w:sz w:val="40"/>
-                <w:szCs w:val="40"/>
-                <w:lang w:val="en-IN" w:eastAsia="en-IN" w:bidi="ml-IN"/>
-              </w:rPr>
-              <w:t>ÆõZy—rç</w:t>
-            </w:r>
-            <w:r>
-              <w:rPr>
-                <w:rFonts w:ascii="BRH Malayalam Extra" w:eastAsia="Times New Roman" w:hAnsi="BRH Malayalam Extra" w:cs="BRH Malayalam Extra"/>
-                <w:color w:val="000000"/>
-                <w:sz w:val="32"/>
-                <w:szCs w:val="40"/>
-                <w:lang w:val="en-IN" w:eastAsia="en-IN" w:bidi="ml-IN"/>
-              </w:rPr>
-              <w:t>–</w:t>
-            </w:r>
-            <w:r>
-              <w:rPr>
-                <w:rFonts w:ascii="BRH Malayalam Extra" w:eastAsia="Times New Roman" w:hAnsi="BRH Malayalam Extra" w:cs="BRH Malayalam Extra"/>
-                <w:color w:val="000000"/>
-                <w:sz w:val="40"/>
-                <w:szCs w:val="40"/>
-                <w:lang w:val="en-IN" w:eastAsia="en-IN" w:bidi="ml-IN"/>
-              </w:rPr>
-              <w:t>byZõ—</w:t>
+                <w:lang w:val="en-IN" w:eastAsia="en-IN" w:bidi="ml-IN"/>
+              </w:rPr>
+              <w:t>j</w:t>
+            </w:r>
+            <w:r>
+              <w:rPr>
+                <w:rFonts w:ascii="BRH Malayalam Extra" w:eastAsia="Times New Roman" w:hAnsi="BRH Malayalam Extra" w:cs="BRH Malayalam Extra"/>
+                <w:color w:val="000000"/>
+                <w:sz w:val="32"/>
+                <w:szCs w:val="40"/>
+                <w:lang w:val="en-IN" w:eastAsia="en-IN" w:bidi="ml-IN"/>
+              </w:rPr>
+              <w:t>–</w:t>
+            </w:r>
+            <w:r>
+              <w:rPr>
+                <w:rFonts w:ascii="BRH Malayalam Extra" w:eastAsia="Times New Roman" w:hAnsi="BRH Malayalam Extra" w:cs="BRH Malayalam Extra"/>
+                <w:color w:val="000000"/>
+                <w:sz w:val="40"/>
+                <w:szCs w:val="40"/>
+                <w:lang w:val="en-IN" w:eastAsia="en-IN" w:bidi="ml-IN"/>
+              </w:rPr>
+              <w:t xml:space="preserve">¥bZ§ | </w:t>
             </w:r>
             <w:r>
               <w:rPr>
@@ -1002,63 +930,27 @@
                 <w:highlight w:val="yellow"/>
                 <w:lang w:val="en-IN" w:eastAsia="en-IN" w:bidi="ml-IN"/>
               </w:rPr>
-              <w:t>Æ</w:t>
-            </w:r>
-            <w:r>
-              <w:rPr>
-                <w:rFonts w:ascii="BRH Malayalam Extra" w:eastAsia="Times New Roman" w:hAnsi="BRH Malayalam Extra" w:cs="BRH Malayalam Extra"/>
-                <w:color w:val="000000"/>
-                <w:sz w:val="40"/>
-                <w:szCs w:val="40"/>
-                <w:lang w:val="en-IN" w:eastAsia="en-IN" w:bidi="ml-IN"/>
-              </w:rPr>
-              <w:t xml:space="preserve">y </w:t>
-            </w:r>
-            <w:r>
-              <w:rPr>
-                <w:rFonts w:ascii="BRH Malayalam Extra" w:eastAsia="Times New Roman" w:hAnsi="BRH Malayalam Extra" w:cs="BRH Malayalam Extra"/>
-                <w:color w:val="000000"/>
-                <w:sz w:val="40"/>
-                <w:szCs w:val="40"/>
-                <w:lang w:val="en-IN" w:eastAsia="en-IN" w:bidi="ml-IN"/>
-              </w:rPr>
-              <w:t>–</w:t>
-            </w:r>
-            <w:r>
-              <w:rPr>
-                <w:rFonts w:ascii="BRH Malayalam Extra" w:eastAsia="Times New Roman" w:hAnsi="BRH Malayalam Extra" w:cs="BRH Malayalam Extra"/>
-                <w:color w:val="000000"/>
-                <w:sz w:val="40"/>
-                <w:szCs w:val="40"/>
-                <w:lang w:val="en-IN" w:eastAsia="en-IN" w:bidi="ml-IN"/>
-              </w:rPr>
-              <w:t xml:space="preserve"> </w:t>
-            </w:r>
-          </w:p>
-          <w:p>
-            <w:pPr>
-              <w:widowControl w:val="0"/>
-              <w:autoSpaceDE w:val="0"/>
-              <w:autoSpaceDN w:val="0"/>
-              <w:adjustRightInd w:val="0"/>
-              <w:spacing w:before="0" w:line="240" w:lineRule="auto"/>
-              <w:rPr>
-                <w:rFonts w:ascii="BRH Malayalam Extra" w:eastAsia="Times New Roman" w:hAnsi="BRH Malayalam Extra" w:cs="BRH Malayalam Extra"/>
-                <w:color w:val="000000"/>
-                <w:sz w:val="40"/>
-                <w:szCs w:val="40"/>
-                <w:lang w:eastAsia="en-IN" w:bidi="ml-IN"/>
-              </w:rPr>
-            </w:pPr>
-            <w:r>
-              <w:rPr>
-                <w:rFonts w:ascii="BRH Malayalam Extra" w:eastAsia="Times New Roman" w:hAnsi="BRH Malayalam Extra" w:cs="BRH Malayalam Extra"/>
-                <w:color w:val="000000"/>
-                <w:sz w:val="40"/>
-                <w:szCs w:val="40"/>
-                <w:lang w:val="en-IN" w:eastAsia="en-IN" w:bidi="ml-IN"/>
-              </w:rPr>
-              <w:t>AZy—rçZ§ |</w:t>
+              <w:t>C</w:t>
+            </w:r>
+            <w:r>
+              <w:rPr>
+                <w:rFonts w:ascii="BRH Malayalam Extra" w:eastAsia="Times New Roman" w:hAnsi="BRH Malayalam Extra" w:cs="BRH Malayalam Extra"/>
+                <w:color w:val="000000"/>
+                <w:sz w:val="32"/>
+                <w:szCs w:val="40"/>
+                <w:lang w:val="en-IN" w:eastAsia="en-IN" w:bidi="ml-IN"/>
+              </w:rPr>
+              <w:t>–</w:t>
+            </w:r>
+            <w:r>
+              <w:rPr>
+                <w:rFonts w:ascii="BRH Malayalam Extra" w:eastAsia="Times New Roman" w:hAnsi="BRH Malayalam Extra" w:cs="BRH Malayalam Extra"/>
+                <w:color w:val="000000"/>
+                <w:sz w:val="40"/>
+                <w:szCs w:val="40"/>
+                <w:lang w:val="en-IN" w:eastAsia="en-IN" w:bidi="ml-IN"/>
+              </w:rPr>
+              <w:t>bÇx˜J |</w:t>
             </w:r>
           </w:p>
         </w:tc>
@@ -1089,113 +981,27 @@
                 <w:szCs w:val="40"/>
                 <w:lang w:val="en-IN" w:eastAsia="en-IN" w:bidi="ml-IN"/>
               </w:rPr>
-              <w:t>A</w:t>
-            </w:r>
-            <w:r>
-              <w:rPr>
-                <w:rFonts w:ascii="BRH Malayalam Extra" w:eastAsia="Times New Roman" w:hAnsi="BRH Malayalam Extra" w:cs="BRH Malayalam Extra"/>
-                <w:color w:val="000000"/>
-                <w:sz w:val="32"/>
-                <w:szCs w:val="40"/>
-                <w:lang w:val="en-IN" w:eastAsia="en-IN" w:bidi="ml-IN"/>
-              </w:rPr>
-              <w:t>–</w:t>
-            </w:r>
-            <w:r>
-              <w:rPr>
-                <w:rFonts w:ascii="BRH Malayalam Extra" w:eastAsia="Times New Roman" w:hAnsi="BRH Malayalam Extra" w:cs="BRH Malayalam Extra"/>
-                <w:color w:val="000000"/>
-                <w:sz w:val="40"/>
-                <w:szCs w:val="40"/>
-                <w:lang w:val="en-IN" w:eastAsia="en-IN" w:bidi="ml-IN"/>
-              </w:rPr>
-              <w:t>ÆõZy—rç</w:t>
-            </w:r>
-            <w:r>
-              <w:rPr>
-                <w:rFonts w:ascii="BRH Malayalam Extra" w:eastAsia="Times New Roman" w:hAnsi="BRH Malayalam Extra" w:cs="BRH Malayalam Extra"/>
-                <w:color w:val="000000"/>
-                <w:sz w:val="32"/>
-                <w:szCs w:val="40"/>
-                <w:lang w:val="en-IN" w:eastAsia="en-IN" w:bidi="ml-IN"/>
-              </w:rPr>
-              <w:t>–</w:t>
-            </w:r>
-            <w:r>
-              <w:rPr>
-                <w:rFonts w:ascii="BRH Malayalam Extra" w:eastAsia="Times New Roman" w:hAnsi="BRH Malayalam Extra" w:cs="BRH Malayalam Extra"/>
-                <w:color w:val="000000"/>
-                <w:sz w:val="40"/>
-                <w:szCs w:val="40"/>
-                <w:lang w:val="en-IN" w:eastAsia="en-IN" w:bidi="ml-IN"/>
-              </w:rPr>
-              <w:t xml:space="preserve">b§ h¡p—dxdy | </w:t>
-            </w:r>
-          </w:p>
-          <w:p>
-            <w:pPr>
-              <w:widowControl w:val="0"/>
-              <w:autoSpaceDE w:val="0"/>
-              <w:autoSpaceDN w:val="0"/>
-              <w:adjustRightInd w:val="0"/>
-              <w:spacing w:before="0" w:line="240" w:lineRule="auto"/>
-              <w:rPr>
-                <w:rFonts w:ascii="BRH Malayalam Extra" w:eastAsia="Times New Roman" w:hAnsi="BRH Malayalam Extra" w:cs="BRH Malayalam Extra"/>
-                <w:color w:val="000000"/>
-                <w:sz w:val="40"/>
-                <w:szCs w:val="40"/>
-                <w:lang w:val="en-IN" w:eastAsia="en-IN" w:bidi="ml-IN"/>
-              </w:rPr>
-            </w:pPr>
-            <w:r>
-              <w:rPr>
-                <w:rFonts w:ascii="BRH Malayalam Extra" w:eastAsia="Times New Roman" w:hAnsi="BRH Malayalam Extra" w:cs="BRH Malayalam Extra"/>
-                <w:color w:val="000000"/>
-                <w:sz w:val="40"/>
-                <w:szCs w:val="40"/>
-                <w:lang w:val="en-IN" w:eastAsia="en-IN" w:bidi="ml-IN"/>
-              </w:rPr>
-              <w:t>A</w:t>
-            </w:r>
-            <w:r>
-              <w:rPr>
-                <w:rFonts w:ascii="BRH Malayalam Extra" w:eastAsia="Times New Roman" w:hAnsi="BRH Malayalam Extra" w:cs="BRH Malayalam Extra"/>
-                <w:color w:val="000000"/>
-                <w:sz w:val="32"/>
-                <w:szCs w:val="40"/>
-                <w:lang w:val="en-IN" w:eastAsia="en-IN" w:bidi="ml-IN"/>
-              </w:rPr>
-              <w:t>–</w:t>
-            </w:r>
-            <w:r>
-              <w:rPr>
-                <w:rFonts w:ascii="BRH Malayalam Extra" w:eastAsia="Times New Roman" w:hAnsi="BRH Malayalam Extra" w:cs="BRH Malayalam Extra"/>
-                <w:color w:val="000000"/>
-                <w:sz w:val="40"/>
-                <w:szCs w:val="40"/>
-                <w:lang w:val="en-IN" w:eastAsia="en-IN" w:bidi="ml-IN"/>
-              </w:rPr>
-              <w:t>ÆõZy—rç</w:t>
-            </w:r>
-            <w:r>
-              <w:rPr>
-                <w:rFonts w:ascii="BRH Malayalam Extra" w:eastAsia="Times New Roman" w:hAnsi="BRH Malayalam Extra" w:cs="BRH Malayalam Extra"/>
-                <w:color w:val="000000"/>
-                <w:sz w:val="32"/>
-                <w:szCs w:val="40"/>
-                <w:lang w:val="en-IN" w:eastAsia="en-IN" w:bidi="ml-IN"/>
-              </w:rPr>
-              <w:t>–</w:t>
-            </w:r>
-            <w:r>
-              <w:rPr>
-                <w:rFonts w:ascii="BRH Malayalam Extra" w:eastAsia="Times New Roman" w:hAnsi="BRH Malayalam Extra" w:cs="BRH Malayalam Extra"/>
-                <w:color w:val="000000"/>
-                <w:sz w:val="40"/>
-                <w:szCs w:val="40"/>
-                <w:lang w:val="en-IN" w:eastAsia="en-IN" w:bidi="ml-IN"/>
-              </w:rPr>
-              <w:t>byZõ—</w:t>
+              <w:t>j</w:t>
+            </w:r>
+            <w:r>
+              <w:rPr>
+                <w:rFonts w:ascii="BRH Malayalam Extra" w:eastAsia="Times New Roman" w:hAnsi="BRH Malayalam Extra" w:cs="BRH Malayalam Extra"/>
+                <w:color w:val="000000"/>
+                <w:sz w:val="32"/>
+                <w:szCs w:val="40"/>
+                <w:lang w:val="en-IN" w:eastAsia="en-IN" w:bidi="ml-IN"/>
+              </w:rPr>
+              <w:t>–</w:t>
+            </w:r>
+            <w:r>
+              <w:rPr>
+                <w:rFonts w:ascii="BRH Malayalam Extra" w:eastAsia="Times New Roman" w:hAnsi="BRH Malayalam Extra" w:cs="BRH Malayalam Extra"/>
+                <w:color w:val="000000"/>
+                <w:sz w:val="40"/>
+                <w:szCs w:val="40"/>
+                <w:lang w:val="en-IN" w:eastAsia="en-IN" w:bidi="ml-IN"/>
+              </w:rPr>
+              <w:t xml:space="preserve">¥bZ§ | </w:t>
             </w:r>
             <w:r>
               <w:rPr>
@@ -1206,63 +1012,17 @@
                 <w:highlight w:val="green"/>
                 <w:lang w:val="en-IN" w:eastAsia="en-IN" w:bidi="ml-IN"/>
               </w:rPr>
-              <w:t>c</w:t>
-            </w:r>
-            <w:r>
-              <w:rPr>
-                <w:rFonts w:ascii="BRH Malayalam Extra" w:eastAsia="Times New Roman" w:hAnsi="BRH Malayalam Extra" w:cs="BRH Malayalam Extra"/>
-                <w:color w:val="000000"/>
-                <w:sz w:val="40"/>
-                <w:szCs w:val="40"/>
-                <w:lang w:val="en-IN" w:eastAsia="en-IN" w:bidi="ml-IN"/>
-              </w:rPr>
-              <w:t xml:space="preserve">y </w:t>
-            </w:r>
-            <w:r>
-              <w:rPr>
-                <w:rFonts w:ascii="BRH Malayalam Extra" w:eastAsia="Times New Roman" w:hAnsi="BRH Malayalam Extra" w:cs="BRH Malayalam Extra"/>
-                <w:color w:val="000000"/>
-                <w:sz w:val="40"/>
-                <w:szCs w:val="40"/>
-                <w:lang w:val="en-IN" w:eastAsia="en-IN" w:bidi="ml-IN"/>
-              </w:rPr>
-              <w:t>–</w:t>
-            </w:r>
-            <w:r>
-              <w:rPr>
-                <w:rFonts w:ascii="BRH Malayalam Extra" w:eastAsia="Times New Roman" w:hAnsi="BRH Malayalam Extra" w:cs="BRH Malayalam Extra"/>
-                <w:color w:val="000000"/>
-                <w:sz w:val="40"/>
-                <w:szCs w:val="40"/>
-                <w:lang w:val="en-IN" w:eastAsia="en-IN" w:bidi="ml-IN"/>
-              </w:rPr>
-              <w:t xml:space="preserve"> </w:t>
-            </w:r>
-          </w:p>
-          <w:p>
-            <w:pPr>
-              <w:widowControl w:val="0"/>
-              <w:autoSpaceDE w:val="0"/>
-              <w:autoSpaceDN w:val="0"/>
-              <w:adjustRightInd w:val="0"/>
-              <w:spacing w:before="0" w:line="240" w:lineRule="auto"/>
-              <w:rPr>
-                <w:rFonts w:ascii="BRH Malayalam Extra" w:eastAsia="Times New Roman" w:hAnsi="BRH Malayalam Extra" w:cs="BRH Malayalam Extra"/>
-                <w:color w:val="000000"/>
-                <w:sz w:val="40"/>
-                <w:szCs w:val="40"/>
-                <w:lang w:val="en-IN" w:eastAsia="en-IN" w:bidi="ml-IN"/>
-              </w:rPr>
-            </w:pPr>
-            <w:r>
-              <w:rPr>
-                <w:rFonts w:ascii="BRH Malayalam Extra" w:eastAsia="Times New Roman" w:hAnsi="BRH Malayalam Extra" w:cs="BRH Malayalam Extra"/>
-                <w:color w:val="000000"/>
-                <w:sz w:val="40"/>
-                <w:szCs w:val="40"/>
-                <w:lang w:val="en-IN" w:eastAsia="en-IN" w:bidi="ml-IN"/>
-              </w:rPr>
-              <w:t>AZy—rçZ§ |</w:t>
+              <w:t>C</w:t>
+            </w:r>
+            <w:r>
+              <w:rPr>
+                <w:rFonts w:ascii="BRH Malayalam Extra" w:eastAsia="Times New Roman" w:hAnsi="BRH Malayalam Extra" w:cs="BRH Malayalam Extra"/>
+                <w:color w:val="000000"/>
+                <w:sz w:val="40"/>
+                <w:szCs w:val="40"/>
+                <w:lang w:val="en-IN" w:eastAsia="en-IN" w:bidi="ml-IN"/>
+              </w:rPr>
+              <w:t>bÇx˜J |</w:t>
             </w:r>
           </w:p>
         </w:tc>
@@ -1309,6 +1069,559 @@
                 <w:sz w:val="28"/>
                 <w:szCs w:val="32"/>
               </w:rPr>
+              <w:t>2.5</w:t>
+            </w:r>
+            <w:r>
+              <w:rPr>
+                <w:rFonts w:cs="Arial"/>
+                <w:b/>
+                <w:sz w:val="28"/>
+                <w:szCs w:val="32"/>
+              </w:rPr>
+              <w:t xml:space="preserve"> – Kramam</w:t>
+            </w:r>
+          </w:p>
+          <w:p>
+            <w:pPr>
+              <w:widowControl w:val="0"/>
+              <w:tabs>
+                <w:tab w:val="left" w:pos="993"/>
+              </w:tabs>
+              <w:autoSpaceDE w:val="0"/>
+              <w:autoSpaceDN w:val="0"/>
+              <w:adjustRightInd w:val="0"/>
+              <w:spacing w:before="0" w:line="252" w:lineRule="auto"/>
+              <w:ind w:right="297"/>
+              <w:rPr>
+                <w:rFonts w:cs="Arial"/>
+                <w:b/>
+                <w:sz w:val="28"/>
+                <w:szCs w:val="32"/>
+                <w:lang w:val="en-IN"/>
+              </w:rPr>
+            </w:pPr>
+            <w:r>
+              <w:rPr>
+                <w:rFonts w:cs="Arial"/>
+                <w:b/>
+                <w:sz w:val="28"/>
+                <w:szCs w:val="32"/>
+                <w:lang w:val="en-IN"/>
+              </w:rPr>
+              <w:t>Krama Vaakyam No.– 28</w:t>
+            </w:r>
+          </w:p>
+          <w:p>
+            <w:pPr>
+              <w:widowControl w:val="0"/>
+              <w:tabs>
+                <w:tab w:val="left" w:pos="993"/>
+              </w:tabs>
+              <w:autoSpaceDE w:val="0"/>
+              <w:autoSpaceDN w:val="0"/>
+              <w:adjustRightInd w:val="0"/>
+              <w:spacing w:before="0" w:line="252" w:lineRule="auto"/>
+              <w:ind w:right="297"/>
+              <w:rPr>
+                <w:rFonts w:cs="Arial"/>
+                <w:b/>
+                <w:sz w:val="28"/>
+                <w:szCs w:val="32"/>
+                <w:lang w:val="it-IT"/>
+              </w:rPr>
+            </w:pPr>
+            <w:r>
+              <w:rPr>
+                <w:rFonts w:cs="Arial"/>
+                <w:b/>
+                <w:sz w:val="28"/>
+                <w:szCs w:val="32"/>
+                <w:lang w:val="it-IT"/>
+              </w:rPr>
+              <w:t>Panchaati No</w:t>
+            </w:r>
+            <w:r>
+              <w:rPr>
+                <w:rFonts w:cs="Arial"/>
+                <w:b/>
+                <w:szCs w:val="32"/>
+                <w:lang w:val="it-IT"/>
+              </w:rPr>
+              <w:t xml:space="preserve">. - </w:t>
+            </w:r>
+            <w:r>
+              <w:rPr>
+                <w:rFonts w:cs="Arial"/>
+                <w:b/>
+                <w:sz w:val="28"/>
+                <w:szCs w:val="32"/>
+                <w:lang w:val="it-IT"/>
+              </w:rPr>
+              <w:t>1</w:t>
+            </w:r>
+            <w:r>
+              <w:rPr>
+                <w:rFonts w:cs="Arial"/>
+                <w:b/>
+                <w:sz w:val="28"/>
+                <w:szCs w:val="32"/>
+                <w:lang w:val="it-IT"/>
+              </w:rPr>
+              <w:t>0</w:t>
+            </w:r>
+          </w:p>
+        </w:tc>
+        <w:tc>
+          <w:tcPr>
+            <w:tcW w:w="5103" w:type="dxa"/>
+          </w:tcPr>
+          <w:p>
+            <w:pPr>
+              <w:widowControl w:val="0"/>
+              <w:autoSpaceDE w:val="0"/>
+              <w:autoSpaceDN w:val="0"/>
+              <w:adjustRightInd w:val="0"/>
+              <w:spacing w:before="0" w:line="240" w:lineRule="auto"/>
+              <w:rPr>
+                <w:rFonts w:ascii="BRH Malayalam Extra" w:eastAsia="Times New Roman" w:hAnsi="BRH Malayalam Extra" w:cs="BRH Malayalam Extra"/>
+                <w:color w:val="000000"/>
+                <w:sz w:val="40"/>
+                <w:szCs w:val="40"/>
+                <w:lang w:val="it-IT" w:eastAsia="en-IN" w:bidi="ml-IN"/>
+              </w:rPr>
+            </w:pPr>
+            <w:r>
+              <w:rPr>
+                <w:rFonts w:ascii="BRH Malayalam Extra" w:eastAsia="Times New Roman" w:hAnsi="BRH Malayalam Extra" w:cs="BRH Malayalam Extra"/>
+                <w:color w:val="000000"/>
+                <w:sz w:val="40"/>
+                <w:szCs w:val="40"/>
+                <w:lang w:val="it-IT" w:eastAsia="en-IN" w:bidi="ml-IN"/>
+              </w:rPr>
+              <w:t>A</w:t>
+            </w:r>
+            <w:r>
+              <w:rPr>
+                <w:rFonts w:ascii="BRH Malayalam Extra" w:eastAsia="Times New Roman" w:hAnsi="BRH Malayalam Extra" w:cs="BRH Malayalam Extra"/>
+                <w:color w:val="000000"/>
+                <w:sz w:val="32"/>
+                <w:szCs w:val="40"/>
+                <w:lang w:val="it-IT" w:eastAsia="en-IN" w:bidi="ml-IN"/>
+              </w:rPr>
+              <w:t>–</w:t>
+            </w:r>
+            <w:r>
+              <w:rPr>
+                <w:rFonts w:ascii="BRH Malayalam Extra" w:eastAsia="Times New Roman" w:hAnsi="BRH Malayalam Extra" w:cs="BRH Malayalam Extra"/>
+                <w:color w:val="000000"/>
+                <w:sz w:val="40"/>
+                <w:szCs w:val="40"/>
+                <w:lang w:val="it-IT" w:eastAsia="en-IN" w:bidi="ml-IN"/>
+              </w:rPr>
+              <w:t>ÆõZy—rç</w:t>
+            </w:r>
+            <w:r>
+              <w:rPr>
+                <w:rFonts w:ascii="BRH Malayalam Extra" w:eastAsia="Times New Roman" w:hAnsi="BRH Malayalam Extra" w:cs="BRH Malayalam Extra"/>
+                <w:color w:val="000000"/>
+                <w:sz w:val="32"/>
+                <w:szCs w:val="40"/>
+                <w:lang w:val="it-IT" w:eastAsia="en-IN" w:bidi="ml-IN"/>
+              </w:rPr>
+              <w:t>–</w:t>
+            </w:r>
+            <w:r>
+              <w:rPr>
+                <w:rFonts w:ascii="BRH Malayalam Extra" w:eastAsia="Times New Roman" w:hAnsi="BRH Malayalam Extra" w:cs="BRH Malayalam Extra"/>
+                <w:color w:val="000000"/>
+                <w:sz w:val="40"/>
+                <w:szCs w:val="40"/>
+                <w:lang w:val="it-IT" w:eastAsia="en-IN" w:bidi="ml-IN"/>
+              </w:rPr>
+              <w:t xml:space="preserve">b§ h¡p—dxdy | </w:t>
+            </w:r>
+          </w:p>
+          <w:p>
+            <w:pPr>
+              <w:widowControl w:val="0"/>
+              <w:autoSpaceDE w:val="0"/>
+              <w:autoSpaceDN w:val="0"/>
+              <w:adjustRightInd w:val="0"/>
+              <w:spacing w:before="0" w:line="240" w:lineRule="auto"/>
+              <w:rPr>
+                <w:rFonts w:ascii="BRH Malayalam Extra" w:eastAsia="Times New Roman" w:hAnsi="BRH Malayalam Extra" w:cs="BRH Malayalam Extra"/>
+                <w:color w:val="000000"/>
+                <w:sz w:val="40"/>
+                <w:szCs w:val="40"/>
+                <w:lang w:val="en-IN" w:eastAsia="en-IN" w:bidi="ml-IN"/>
+              </w:rPr>
+            </w:pPr>
+            <w:r>
+              <w:rPr>
+                <w:rFonts w:ascii="BRH Malayalam Extra" w:eastAsia="Times New Roman" w:hAnsi="BRH Malayalam Extra" w:cs="BRH Malayalam Extra"/>
+                <w:color w:val="000000"/>
+                <w:sz w:val="40"/>
+                <w:szCs w:val="40"/>
+                <w:lang w:val="en-IN" w:eastAsia="en-IN" w:bidi="ml-IN"/>
+              </w:rPr>
+              <w:t>A</w:t>
+            </w:r>
+            <w:r>
+              <w:rPr>
+                <w:rFonts w:ascii="BRH Malayalam Extra" w:eastAsia="Times New Roman" w:hAnsi="BRH Malayalam Extra" w:cs="BRH Malayalam Extra"/>
+                <w:color w:val="000000"/>
+                <w:sz w:val="32"/>
+                <w:szCs w:val="40"/>
+                <w:lang w:val="en-IN" w:eastAsia="en-IN" w:bidi="ml-IN"/>
+              </w:rPr>
+              <w:t>–</w:t>
+            </w:r>
+            <w:r>
+              <w:rPr>
+                <w:rFonts w:ascii="BRH Malayalam Extra" w:eastAsia="Times New Roman" w:hAnsi="BRH Malayalam Extra" w:cs="BRH Malayalam Extra"/>
+                <w:color w:val="000000"/>
+                <w:sz w:val="40"/>
+                <w:szCs w:val="40"/>
+                <w:lang w:val="en-IN" w:eastAsia="en-IN" w:bidi="ml-IN"/>
+              </w:rPr>
+              <w:t>ÆõZy—rç</w:t>
+            </w:r>
+            <w:r>
+              <w:rPr>
+                <w:rFonts w:ascii="BRH Malayalam Extra" w:eastAsia="Times New Roman" w:hAnsi="BRH Malayalam Extra" w:cs="BRH Malayalam Extra"/>
+                <w:color w:val="000000"/>
+                <w:sz w:val="32"/>
+                <w:szCs w:val="40"/>
+                <w:lang w:val="en-IN" w:eastAsia="en-IN" w:bidi="ml-IN"/>
+              </w:rPr>
+              <w:t>–</w:t>
+            </w:r>
+            <w:r>
+              <w:rPr>
+                <w:rFonts w:ascii="BRH Malayalam Extra" w:eastAsia="Times New Roman" w:hAnsi="BRH Malayalam Extra" w:cs="BRH Malayalam Extra"/>
+                <w:color w:val="000000"/>
+                <w:sz w:val="40"/>
+                <w:szCs w:val="40"/>
+                <w:lang w:val="en-IN" w:eastAsia="en-IN" w:bidi="ml-IN"/>
+              </w:rPr>
+              <w:t>byZõ—</w:t>
+            </w:r>
+            <w:r>
+              <w:rPr>
+                <w:rFonts w:ascii="BRH Malayalam Extra" w:eastAsia="Times New Roman" w:hAnsi="BRH Malayalam Extra" w:cs="BRH Malayalam Extra"/>
+                <w:color w:val="000000"/>
+                <w:sz w:val="40"/>
+                <w:szCs w:val="40"/>
+                <w:highlight w:val="yellow"/>
+                <w:lang w:val="en-IN" w:eastAsia="en-IN" w:bidi="ml-IN"/>
+              </w:rPr>
+              <w:t>Æ</w:t>
+            </w:r>
+            <w:r>
+              <w:rPr>
+                <w:rFonts w:ascii="BRH Malayalam Extra" w:eastAsia="Times New Roman" w:hAnsi="BRH Malayalam Extra" w:cs="BRH Malayalam Extra"/>
+                <w:color w:val="000000"/>
+                <w:sz w:val="40"/>
+                <w:szCs w:val="40"/>
+                <w:lang w:val="en-IN" w:eastAsia="en-IN" w:bidi="ml-IN"/>
+              </w:rPr>
+              <w:t xml:space="preserve">y </w:t>
+            </w:r>
+            <w:r>
+              <w:rPr>
+                <w:rFonts w:ascii="BRH Malayalam Extra" w:eastAsia="Times New Roman" w:hAnsi="BRH Malayalam Extra" w:cs="BRH Malayalam Extra"/>
+                <w:color w:val="000000"/>
+                <w:sz w:val="40"/>
+                <w:szCs w:val="40"/>
+                <w:lang w:val="en-IN" w:eastAsia="en-IN" w:bidi="ml-IN"/>
+              </w:rPr>
+              <w:t>–</w:t>
+            </w:r>
+            <w:r>
+              <w:rPr>
+                <w:rFonts w:ascii="BRH Malayalam Extra" w:eastAsia="Times New Roman" w:hAnsi="BRH Malayalam Extra" w:cs="BRH Malayalam Extra"/>
+                <w:color w:val="000000"/>
+                <w:sz w:val="40"/>
+                <w:szCs w:val="40"/>
+                <w:lang w:val="en-IN" w:eastAsia="en-IN" w:bidi="ml-IN"/>
+              </w:rPr>
+              <w:t xml:space="preserve"> </w:t>
+            </w:r>
+          </w:p>
+          <w:p>
+            <w:pPr>
+              <w:widowControl w:val="0"/>
+              <w:autoSpaceDE w:val="0"/>
+              <w:autoSpaceDN w:val="0"/>
+              <w:adjustRightInd w:val="0"/>
+              <w:spacing w:before="0" w:line="240" w:lineRule="auto"/>
+              <w:rPr>
+                <w:rFonts w:ascii="BRH Malayalam Extra" w:eastAsia="Times New Roman" w:hAnsi="BRH Malayalam Extra" w:cs="BRH Malayalam Extra"/>
+                <w:color w:val="000000"/>
+                <w:sz w:val="40"/>
+                <w:szCs w:val="40"/>
+                <w:lang w:eastAsia="en-IN" w:bidi="ml-IN"/>
+              </w:rPr>
+            </w:pPr>
+            <w:r>
+              <w:rPr>
+                <w:rFonts w:ascii="BRH Malayalam Extra" w:eastAsia="Times New Roman" w:hAnsi="BRH Malayalam Extra" w:cs="BRH Malayalam Extra"/>
+                <w:color w:val="000000"/>
+                <w:sz w:val="40"/>
+                <w:szCs w:val="40"/>
+                <w:lang w:val="en-IN" w:eastAsia="en-IN" w:bidi="ml-IN"/>
+              </w:rPr>
+              <w:t>AZy—rçZ§ |</w:t>
+            </w:r>
+          </w:p>
+        </w:tc>
+        <w:tc>
+          <w:tcPr>
+            <w:tcW w:w="5386" w:type="dxa"/>
+          </w:tcPr>
+          <w:p>
+            <w:pPr>
+              <w:widowControl w:val="0"/>
+              <w:autoSpaceDE w:val="0"/>
+              <w:autoSpaceDN w:val="0"/>
+              <w:adjustRightInd w:val="0"/>
+              <w:spacing w:before="0" w:line="240" w:lineRule="auto"/>
+              <w:rPr>
+                <w:rFonts w:ascii="BRH Malayalam Extra" w:eastAsia="Times New Roman" w:hAnsi="BRH Malayalam Extra" w:cs="BRH Malayalam Extra"/>
+                <w:color w:val="000000"/>
+                <w:sz w:val="40"/>
+                <w:szCs w:val="40"/>
+                <w:lang w:val="en-IN" w:eastAsia="en-IN" w:bidi="ml-IN"/>
+              </w:rPr>
+            </w:pPr>
+            <w:r>
+              <w:rPr>
+                <w:rFonts w:ascii="BRH Malayalam Extra" w:eastAsia="Times New Roman" w:hAnsi="BRH Malayalam Extra" w:cs="BRH Malayalam Extra"/>
+                <w:color w:val="000000"/>
+                <w:sz w:val="40"/>
+                <w:szCs w:val="40"/>
+                <w:lang w:val="en-IN" w:eastAsia="en-IN" w:bidi="ml-IN"/>
+              </w:rPr>
+              <w:t>A</w:t>
+            </w:r>
+            <w:r>
+              <w:rPr>
+                <w:rFonts w:ascii="BRH Malayalam Extra" w:eastAsia="Times New Roman" w:hAnsi="BRH Malayalam Extra" w:cs="BRH Malayalam Extra"/>
+                <w:color w:val="000000"/>
+                <w:sz w:val="32"/>
+                <w:szCs w:val="40"/>
+                <w:lang w:val="en-IN" w:eastAsia="en-IN" w:bidi="ml-IN"/>
+              </w:rPr>
+              <w:t>–</w:t>
+            </w:r>
+            <w:r>
+              <w:rPr>
+                <w:rFonts w:ascii="BRH Malayalam Extra" w:eastAsia="Times New Roman" w:hAnsi="BRH Malayalam Extra" w:cs="BRH Malayalam Extra"/>
+                <w:color w:val="000000"/>
+                <w:sz w:val="40"/>
+                <w:szCs w:val="40"/>
+                <w:lang w:val="en-IN" w:eastAsia="en-IN" w:bidi="ml-IN"/>
+              </w:rPr>
+              <w:t>ÆõZy—rç</w:t>
+            </w:r>
+            <w:r>
+              <w:rPr>
+                <w:rFonts w:ascii="BRH Malayalam Extra" w:eastAsia="Times New Roman" w:hAnsi="BRH Malayalam Extra" w:cs="BRH Malayalam Extra"/>
+                <w:color w:val="000000"/>
+                <w:sz w:val="32"/>
+                <w:szCs w:val="40"/>
+                <w:lang w:val="en-IN" w:eastAsia="en-IN" w:bidi="ml-IN"/>
+              </w:rPr>
+              <w:t>–</w:t>
+            </w:r>
+            <w:r>
+              <w:rPr>
+                <w:rFonts w:ascii="BRH Malayalam Extra" w:eastAsia="Times New Roman" w:hAnsi="BRH Malayalam Extra" w:cs="BRH Malayalam Extra"/>
+                <w:color w:val="000000"/>
+                <w:sz w:val="40"/>
+                <w:szCs w:val="40"/>
+                <w:lang w:val="en-IN" w:eastAsia="en-IN" w:bidi="ml-IN"/>
+              </w:rPr>
+              <w:t xml:space="preserve">b§ h¡p—dxdy | </w:t>
+            </w:r>
+          </w:p>
+          <w:p>
+            <w:pPr>
+              <w:widowControl w:val="0"/>
+              <w:autoSpaceDE w:val="0"/>
+              <w:autoSpaceDN w:val="0"/>
+              <w:adjustRightInd w:val="0"/>
+              <w:spacing w:before="0" w:line="240" w:lineRule="auto"/>
+              <w:rPr>
+                <w:rFonts w:ascii="BRH Malayalam Extra" w:eastAsia="Times New Roman" w:hAnsi="BRH Malayalam Extra" w:cs="BRH Malayalam Extra"/>
+                <w:color w:val="000000"/>
+                <w:sz w:val="40"/>
+                <w:szCs w:val="40"/>
+                <w:lang w:val="en-IN" w:eastAsia="en-IN" w:bidi="ml-IN"/>
+              </w:rPr>
+            </w:pPr>
+            <w:r>
+              <w:rPr>
+                <w:rFonts w:ascii="BRH Malayalam Extra" w:eastAsia="Times New Roman" w:hAnsi="BRH Malayalam Extra" w:cs="BRH Malayalam Extra"/>
+                <w:color w:val="000000"/>
+                <w:sz w:val="40"/>
+                <w:szCs w:val="40"/>
+                <w:lang w:val="en-IN" w:eastAsia="en-IN" w:bidi="ml-IN"/>
+              </w:rPr>
+              <w:t>A</w:t>
+            </w:r>
+            <w:r>
+              <w:rPr>
+                <w:rFonts w:ascii="BRH Malayalam Extra" w:eastAsia="Times New Roman" w:hAnsi="BRH Malayalam Extra" w:cs="BRH Malayalam Extra"/>
+                <w:color w:val="000000"/>
+                <w:sz w:val="32"/>
+                <w:szCs w:val="40"/>
+                <w:lang w:val="en-IN" w:eastAsia="en-IN" w:bidi="ml-IN"/>
+              </w:rPr>
+              <w:t>–</w:t>
+            </w:r>
+            <w:r>
+              <w:rPr>
+                <w:rFonts w:ascii="BRH Malayalam Extra" w:eastAsia="Times New Roman" w:hAnsi="BRH Malayalam Extra" w:cs="BRH Malayalam Extra"/>
+                <w:color w:val="000000"/>
+                <w:sz w:val="40"/>
+                <w:szCs w:val="40"/>
+                <w:lang w:val="en-IN" w:eastAsia="en-IN" w:bidi="ml-IN"/>
+              </w:rPr>
+              <w:t>ÆõZy—rç</w:t>
+            </w:r>
+            <w:r>
+              <w:rPr>
+                <w:rFonts w:ascii="BRH Malayalam Extra" w:eastAsia="Times New Roman" w:hAnsi="BRH Malayalam Extra" w:cs="BRH Malayalam Extra"/>
+                <w:color w:val="000000"/>
+                <w:sz w:val="32"/>
+                <w:szCs w:val="40"/>
+                <w:lang w:val="en-IN" w:eastAsia="en-IN" w:bidi="ml-IN"/>
+              </w:rPr>
+              <w:t>–</w:t>
+            </w:r>
+            <w:r>
+              <w:rPr>
+                <w:rFonts w:ascii="BRH Malayalam Extra" w:eastAsia="Times New Roman" w:hAnsi="BRH Malayalam Extra" w:cs="BRH Malayalam Extra"/>
+                <w:color w:val="000000"/>
+                <w:sz w:val="40"/>
+                <w:szCs w:val="40"/>
+                <w:lang w:val="en-IN" w:eastAsia="en-IN" w:bidi="ml-IN"/>
+              </w:rPr>
+              <w:t>byZõ—</w:t>
+            </w:r>
+            <w:r>
+              <w:rPr>
+                <w:rFonts w:ascii="BRH Malayalam Extra" w:eastAsia="Times New Roman" w:hAnsi="BRH Malayalam Extra" w:cs="BRH Malayalam Extra"/>
+                <w:color w:val="000000"/>
+                <w:sz w:val="40"/>
+                <w:szCs w:val="40"/>
+                <w:highlight w:val="green"/>
+                <w:lang w:val="en-IN" w:eastAsia="en-IN" w:bidi="ml-IN"/>
+              </w:rPr>
+              <w:t>c</w:t>
+            </w:r>
+            <w:r>
+              <w:rPr>
+                <w:rFonts w:ascii="BRH Malayalam Extra" w:eastAsia="Times New Roman" w:hAnsi="BRH Malayalam Extra" w:cs="BRH Malayalam Extra"/>
+                <w:color w:val="000000"/>
+                <w:sz w:val="40"/>
+                <w:szCs w:val="40"/>
+                <w:lang w:val="en-IN" w:eastAsia="en-IN" w:bidi="ml-IN"/>
+              </w:rPr>
+              <w:t xml:space="preserve">y </w:t>
+            </w:r>
+            <w:r>
+              <w:rPr>
+                <w:rFonts w:ascii="BRH Malayalam Extra" w:eastAsia="Times New Roman" w:hAnsi="BRH Malayalam Extra" w:cs="BRH Malayalam Extra"/>
+                <w:color w:val="000000"/>
+                <w:sz w:val="40"/>
+                <w:szCs w:val="40"/>
+                <w:lang w:val="en-IN" w:eastAsia="en-IN" w:bidi="ml-IN"/>
+              </w:rPr>
+              <w:t>–</w:t>
+            </w:r>
+            <w:r>
+              <w:rPr>
+                <w:rFonts w:ascii="BRH Malayalam Extra" w:eastAsia="Times New Roman" w:hAnsi="BRH Malayalam Extra" w:cs="BRH Malayalam Extra"/>
+                <w:color w:val="000000"/>
+                <w:sz w:val="40"/>
+                <w:szCs w:val="40"/>
+                <w:lang w:val="en-IN" w:eastAsia="en-IN" w:bidi="ml-IN"/>
+              </w:rPr>
+              <w:t xml:space="preserve"> </w:t>
+            </w:r>
+          </w:p>
+          <w:p>
+            <w:pPr>
+              <w:widowControl w:val="0"/>
+              <w:autoSpaceDE w:val="0"/>
+              <w:autoSpaceDN w:val="0"/>
+              <w:adjustRightInd w:val="0"/>
+              <w:spacing w:before="0" w:line="240" w:lineRule="auto"/>
+              <w:rPr>
+                <w:rFonts w:ascii="BRH Malayalam Extra" w:eastAsia="Times New Roman" w:hAnsi="BRH Malayalam Extra" w:cs="BRH Malayalam Extra"/>
+                <w:color w:val="000000"/>
+                <w:sz w:val="40"/>
+                <w:szCs w:val="40"/>
+                <w:lang w:val="en-IN" w:eastAsia="en-IN" w:bidi="ml-IN"/>
+              </w:rPr>
+            </w:pPr>
+            <w:r>
+              <w:rPr>
+                <w:rFonts w:ascii="BRH Malayalam Extra" w:eastAsia="Times New Roman" w:hAnsi="BRH Malayalam Extra" w:cs="BRH Malayalam Extra"/>
+                <w:color w:val="000000"/>
+                <w:sz w:val="40"/>
+                <w:szCs w:val="40"/>
+                <w:lang w:val="en-IN" w:eastAsia="en-IN" w:bidi="ml-IN"/>
+              </w:rPr>
+              <w:t>AZy—rçZ§ |</w:t>
+            </w:r>
+          </w:p>
+        </w:tc>
+      </w:tr>
+      <w:tr>
+        <w:trPr>
+          <w:trHeight w:val="1118"/>
+        </w:trPr>
+        <w:tc>
+          <w:tcPr>
+            <w:tcW w:w="3906" w:type="dxa"/>
+          </w:tcPr>
+          <w:p>
+            <w:pPr>
+              <w:widowControl w:val="0"/>
+              <w:tabs>
+                <w:tab w:val="left" w:pos="993"/>
+              </w:tabs>
+              <w:autoSpaceDE w:val="0"/>
+              <w:autoSpaceDN w:val="0"/>
+              <w:adjustRightInd w:val="0"/>
+              <w:spacing w:before="0" w:line="252" w:lineRule="auto"/>
+              <w:ind w:right="297"/>
+              <w:rPr>
+                <w:rFonts w:cs="Arial"/>
+                <w:b/>
+                <w:sz w:val="28"/>
+                <w:szCs w:val="32"/>
+              </w:rPr>
+            </w:pPr>
+            <w:r>
+              <w:rPr>
+                <w:rFonts w:cs="Arial"/>
+                <w:b/>
+                <w:sz w:val="28"/>
+                <w:szCs w:val="32"/>
+              </w:rPr>
+              <w:t>T.S.4.6.</w:t>
+            </w:r>
+            <w:r>
+              <w:rPr>
+                <w:rFonts w:cs="Arial"/>
+                <w:b/>
+                <w:sz w:val="28"/>
+                <w:szCs w:val="32"/>
+              </w:rPr>
               <w:t>3.2</w:t>
             </w:r>
             <w:r>
@@ -1623,33 +1936,6 @@
                 <w:szCs w:val="32"/>
               </w:rPr>
             </w:pPr>
-            <w:r>
-              <w:rPr>
-                <w:rFonts w:cs="Arial"/>
-                <w:b/>
-                <w:sz w:val="28"/>
-                <w:szCs w:val="32"/>
-              </w:rPr>
-              <w:t>T.S.4.6.</w:t>
-            </w:r>
-            <w:r>
-              <w:rPr>
-                <w:rFonts w:cs="Arial"/>
-                <w:b/>
-                <w:sz w:val="28"/>
-                <w:szCs w:val="32"/>
-              </w:rPr>
-              <w:t>4.2</w:t>
-            </w:r>
-            <w:r>
-              <w:rPr>
-                <w:rFonts w:cs="Arial"/>
-                <w:b/>
-                <w:sz w:val="28"/>
-                <w:szCs w:val="32"/>
-              </w:rPr>
-              <w:t xml:space="preserve"> – Kramam</w:t>
-            </w:r>
           </w:p>
           <w:p>
             <w:pPr>
@@ -1667,19 +1953,8 @@
                 <w:b/>
                 <w:sz w:val="28"/>
                 <w:szCs w:val="32"/>
-                <w:lang w:val="en-IN"/>
-              </w:rPr>
-            </w:pPr>
-            <w:r>
-              <w:rPr>
-                <w:rFonts w:cs="Arial"/>
-                <w:b/>
-                <w:sz w:val="28"/>
-                <w:szCs w:val="32"/>
-                <w:lang w:val="en-IN"/>
-              </w:rPr>
-              <w:t>Krama Vaakyam No.– 33</w:t>
-            </w:r>
+              </w:rPr>
+            </w:pPr>
           </w:p>
           <w:p>
             <w:pPr>
@@ -1697,6 +1972,52 @@
                 <w:b/>
                 <w:sz w:val="28"/>
                 <w:szCs w:val="32"/>
+              </w:rPr>
+            </w:pPr>
+            <w:r>
+              <w:rPr>
+                <w:rFonts w:cs="Arial"/>
+                <w:b/>
+                <w:sz w:val="28"/>
+                <w:szCs w:val="32"/>
+              </w:rPr>
+              <w:t>T.S.4.6.</w:t>
+            </w:r>
+            <w:r>
+              <w:rPr>
+                <w:rFonts w:cs="Arial"/>
+                <w:b/>
+                <w:sz w:val="28"/>
+                <w:szCs w:val="32"/>
+              </w:rPr>
+              <w:t>4.4</w:t>
+            </w:r>
+            <w:r>
+              <w:rPr>
+                <w:rFonts w:cs="Arial"/>
+                <w:b/>
+                <w:sz w:val="28"/>
+                <w:szCs w:val="32"/>
+              </w:rPr>
+              <w:t xml:space="preserve"> – Kramam</w:t>
+            </w:r>
+          </w:p>
+          <w:p>
+            <w:pPr>
+              <w:widowControl w:val="0"/>
+              <w:tabs>
+                <w:tab w:val="left" w:pos="993"/>
+              </w:tabs>
+              <w:autoSpaceDE w:val="0"/>
+              <w:autoSpaceDN w:val="0"/>
+              <w:adjustRightInd w:val="0"/>
+              <w:spacing w:before="0" w:line="240" w:lineRule="auto"/>
+              <w:ind w:right="297"/>
+              <w:rPr>
+                <w:rFonts w:cs="Arial"/>
+                <w:b/>
+                <w:sz w:val="28"/>
+                <w:szCs w:val="32"/>
                 <w:lang w:val="it-IT"/>
               </w:rPr>
             </w:pPr>
@@ -1708,6 +2029,46 @@
                 <w:szCs w:val="32"/>
                 <w:lang w:val="it-IT"/>
               </w:rPr>
+              <w:t xml:space="preserve">Krama Vaakyam No.– </w:t>
+            </w:r>
+            <w:r>
+              <w:rPr>
+                <w:rFonts w:cs="Arial"/>
+                <w:b/>
+                <w:sz w:val="28"/>
+                <w:szCs w:val="32"/>
+                <w:lang w:val="it-IT"/>
+              </w:rPr>
+              <w:t>19</w:t>
+            </w:r>
+          </w:p>
+          <w:p>
+            <w:pPr>
+              <w:widowControl w:val="0"/>
+              <w:tabs>
+                <w:tab w:val="left" w:pos="993"/>
+              </w:tabs>
+              <w:autoSpaceDE w:val="0"/>
+              <w:autoSpaceDN w:val="0"/>
+              <w:adjustRightInd w:val="0"/>
+              <w:spacing w:before="0" w:line="240" w:lineRule="auto"/>
+              <w:ind w:right="297"/>
+              <w:rPr>
+                <w:rFonts w:cs="Arial"/>
+                <w:b/>
+                <w:sz w:val="28"/>
+                <w:szCs w:val="32"/>
+                <w:lang w:val="it-IT"/>
+              </w:rPr>
+            </w:pPr>
+            <w:r>
+              <w:rPr>
+                <w:rFonts w:cs="Arial"/>
+                <w:b/>
+                <w:sz w:val="28"/>
+                <w:szCs w:val="32"/>
+                <w:lang w:val="it-IT"/>
+              </w:rPr>
               <w:t>Panchaati No</w:t>
             </w:r>
             <w:r>
@@ -1727,7 +2088,7 @@
                 <w:szCs w:val="32"/>
                 <w:lang w:val="it-IT"/>
               </w:rPr>
-              <w:t>17</w:t>
+              <w:t>19</w:t>
             </w:r>
           </w:p>
         </w:tc>
@@ -1747,18 +2108,78 @@
                 <w:color w:val="000000"/>
                 <w:sz w:val="40"/>
                 <w:szCs w:val="40"/>
-                <w:lang w:val="it-IT" w:eastAsia="en-IN" w:bidi="ml-IN"/>
-              </w:rPr>
-            </w:pPr>
-            <w:r>
-              <w:rPr>
-                <w:rFonts w:ascii="BRH Malayalam Extra" w:eastAsia="Times New Roman" w:hAnsi="BRH Malayalam Extra" w:cs="BRH Malayalam Extra"/>
-                <w:color w:val="000000"/>
-                <w:sz w:val="40"/>
-                <w:szCs w:val="40"/>
-                <w:lang w:val="it-IT" w:eastAsia="en-IN" w:bidi="ml-IN"/>
-              </w:rPr>
-              <w:t>CöÉ</w:t>
+                <w:lang w:eastAsia="en-IN" w:bidi="ml-IN"/>
+              </w:rPr>
+            </w:pPr>
+            <w:r>
+              <w:rPr>
+                <w:rFonts w:ascii="BRH Malayalam Extra" w:eastAsia="Times New Roman" w:hAnsi="BRH Malayalam Extra" w:cs="BRH Malayalam Extra"/>
+                <w:color w:val="000000"/>
+                <w:sz w:val="40"/>
+                <w:szCs w:val="40"/>
+                <w:lang w:val="en-IN" w:eastAsia="en-IN" w:bidi="ml-IN"/>
+              </w:rPr>
+              <w:t>ix</w:t>
+            </w:r>
+            <w:r>
+              <w:rPr>
+                <w:rFonts w:ascii="BRH Malayalam Extra" w:eastAsia="Times New Roman" w:hAnsi="BRH Malayalam Extra" w:cs="BRH Malayalam Extra"/>
+                <w:color w:val="000000"/>
+                <w:sz w:val="32"/>
+                <w:szCs w:val="40"/>
+                <w:lang w:val="en-IN" w:eastAsia="en-IN" w:bidi="ml-IN"/>
+              </w:rPr>
+              <w:t>–</w:t>
+            </w:r>
+            <w:r>
+              <w:rPr>
+                <w:rFonts w:ascii="BRH Malayalam Extra" w:eastAsia="Times New Roman" w:hAnsi="BRH Malayalam Extra" w:cs="BRH Malayalam Extra"/>
+                <w:color w:val="000000"/>
+                <w:sz w:val="40"/>
+                <w:szCs w:val="40"/>
+                <w:lang w:val="en-IN" w:eastAsia="en-IN" w:bidi="ml-IN"/>
+              </w:rPr>
+              <w:t>i</w:t>
+            </w:r>
+            <w:r>
+              <w:rPr>
+                <w:rFonts w:ascii="BRH Malayalam Extra" w:eastAsia="Times New Roman" w:hAnsi="BRH Malayalam Extra" w:cs="BRH Malayalam Extra"/>
+                <w:color w:val="000000"/>
+                <w:sz w:val="32"/>
+                <w:szCs w:val="40"/>
+                <w:lang w:val="en-IN" w:eastAsia="en-IN" w:bidi="ml-IN"/>
+              </w:rPr>
+              <w:t>–</w:t>
+            </w:r>
+            <w:r>
+              <w:rPr>
+                <w:rFonts w:ascii="BRH Malayalam Extra" w:eastAsia="Times New Roman" w:hAnsi="BRH Malayalam Extra" w:cs="BRH Malayalam Extra"/>
+                <w:color w:val="000000"/>
+                <w:sz w:val="40"/>
+                <w:szCs w:val="40"/>
+                <w:lang w:val="en-IN" w:eastAsia="en-IN" w:bidi="ml-IN"/>
+              </w:rPr>
+              <w:t>Kxdx</w:t>
+            </w:r>
+            <w:r>
+              <w:rPr>
+                <w:rFonts w:ascii="BRH Malayalam Extra" w:eastAsia="Times New Roman" w:hAnsi="BRH Malayalam Extra" w:cs="BRH Malayalam Extra"/>
+                <w:color w:val="000000"/>
+                <w:sz w:val="32"/>
+                <w:szCs w:val="40"/>
+                <w:lang w:val="en-IN" w:eastAsia="en-IN" w:bidi="ml-IN"/>
+              </w:rPr>
+              <w:t>–</w:t>
+            </w:r>
+            <w:r>
+              <w:rPr>
+                <w:rFonts w:ascii="BRH Malayalam Extra" w:eastAsia="Times New Roman" w:hAnsi="BRH Malayalam Extra" w:cs="BRH Malayalam Extra"/>
+                <w:color w:val="000000"/>
+                <w:sz w:val="40"/>
+                <w:szCs w:val="40"/>
+                <w:lang w:val="en-IN" w:eastAsia="en-IN" w:bidi="ml-IN"/>
+              </w:rPr>
+              <w:t>I itx</w:t>
             </w:r>
             <w:r>
               <w:rPr>
@@ -1766,7 +2187,7 @@
                 <w:color w:val="000000"/>
                 <w:sz w:val="36"/>
                 <w:szCs w:val="40"/>
-                <w:lang w:val="it-IT" w:eastAsia="en-IN" w:bidi="ml-IN"/>
+                <w:lang w:val="en-IN" w:eastAsia="en-IN" w:bidi="ml-IN"/>
               </w:rPr>
               <w:t>óè</w:t>
             </w:r>
@@ -1776,106 +2197,77 @@
                 <w:color w:val="000000"/>
                 <w:sz w:val="40"/>
                 <w:szCs w:val="40"/>
-                <w:lang w:val="it-IT" w:eastAsia="en-IN" w:bidi="ml-IN"/>
-              </w:rPr>
-              <w:t>— s</w:t>
-            </w:r>
-            <w:r>
-              <w:rPr>
-                <w:rFonts w:ascii="BRH Malayalam Extra" w:eastAsia="Times New Roman" w:hAnsi="BRH Malayalam Extra" w:cs="BRH Malayalam Extra"/>
-                <w:color w:val="000000"/>
-                <w:sz w:val="40"/>
+                <w:lang w:val="en-IN" w:eastAsia="en-IN" w:bidi="ml-IN"/>
+              </w:rPr>
+              <w:t>—sy | itx</w:t>
+            </w:r>
+            <w:r>
+              <w:rPr>
+                <w:rFonts w:ascii="BRH Devanagari Extra" w:eastAsia="Times New Roman" w:hAnsi="BRH Devanagari Extra" w:cs="BRH Malayalam Extra"/>
+                <w:color w:val="000000"/>
+                <w:sz w:val="36"/>
                 <w:szCs w:val="40"/>
                 <w:highlight w:val="yellow"/>
-                <w:lang w:val="it-IT" w:eastAsia="en-IN" w:bidi="ml-IN"/>
-              </w:rPr>
-              <w:t>Lx</w:t>
-            </w:r>
-            <w:r>
-              <w:rPr>
-                <w:rFonts w:ascii="BRH Malayalam Extra" w:eastAsia="Times New Roman" w:hAnsi="BRH Malayalam Extra" w:cs="BRH Malayalam Extra"/>
-                <w:color w:val="000000"/>
-                <w:sz w:val="32"/>
-                <w:szCs w:val="40"/>
-                <w:lang w:val="it-IT" w:eastAsia="en-IN" w:bidi="ml-IN"/>
-              </w:rPr>
-              <w:t>–</w:t>
-            </w:r>
-            <w:r>
-              <w:rPr>
-                <w:rFonts w:ascii="BRH Malayalam Extra" w:eastAsia="Times New Roman" w:hAnsi="BRH Malayalam Extra" w:cs="BRH Malayalam Extra"/>
-                <w:color w:val="000000"/>
-                <w:sz w:val="40"/>
-                <w:szCs w:val="40"/>
-                <w:lang w:val="it-IT" w:eastAsia="en-IN" w:bidi="ml-IN"/>
-              </w:rPr>
-              <w:t xml:space="preserve">jJ | </w:t>
-            </w:r>
-          </w:p>
-          <w:p>
-            <w:pPr>
-              <w:widowControl w:val="0"/>
-              <w:autoSpaceDE w:val="0"/>
-              <w:autoSpaceDN w:val="0"/>
-              <w:adjustRightInd w:val="0"/>
-              <w:spacing w:before="0" w:line="240" w:lineRule="auto"/>
-              <w:rPr>
-                <w:rFonts w:ascii="BRH Malayalam Extra" w:eastAsia="Times New Roman" w:hAnsi="BRH Malayalam Extra" w:cs="BRH Malayalam Extra"/>
-                <w:color w:val="000000"/>
-                <w:sz w:val="40"/>
-                <w:szCs w:val="40"/>
-                <w:lang w:val="it-IT" w:eastAsia="en-IN" w:bidi="ml-IN"/>
-              </w:rPr>
-            </w:pPr>
-            <w:r>
-              <w:rPr>
-                <w:rFonts w:ascii="BRH Malayalam Extra" w:eastAsia="Times New Roman" w:hAnsi="BRH Malayalam Extra" w:cs="BRH Malayalam Extra"/>
-                <w:color w:val="000000"/>
-                <w:sz w:val="40"/>
-                <w:szCs w:val="40"/>
-                <w:lang w:val="it-IT" w:eastAsia="en-IN" w:bidi="ml-IN"/>
-              </w:rPr>
-              <w:t>s</w:t>
-            </w:r>
-            <w:r>
-              <w:rPr>
-                <w:rFonts w:ascii="BRH Malayalam Extra" w:eastAsia="Times New Roman" w:hAnsi="BRH Malayalam Extra" w:cs="BRH Malayalam Extra"/>
-                <w:color w:val="000000"/>
-                <w:sz w:val="32"/>
-                <w:szCs w:val="40"/>
-                <w:lang w:val="it-IT" w:eastAsia="en-IN" w:bidi="ml-IN"/>
-              </w:rPr>
-              <w:t>–</w:t>
-            </w:r>
-            <w:r>
-              <w:rPr>
-                <w:rFonts w:ascii="BRH Malayalam Extra" w:eastAsia="Times New Roman" w:hAnsi="BRH Malayalam Extra" w:cs="BRH Malayalam Extra"/>
-                <w:color w:val="000000"/>
-                <w:sz w:val="40"/>
-                <w:szCs w:val="40"/>
-                <w:lang w:val="it-IT" w:eastAsia="en-IN" w:bidi="ml-IN"/>
-              </w:rPr>
-              <w:t>Lx</w:t>
-            </w:r>
-            <w:r>
-              <w:rPr>
-                <w:rFonts w:ascii="BRH Malayalam Extra" w:eastAsia="Times New Roman" w:hAnsi="BRH Malayalam Extra" w:cs="BRH Malayalam Extra"/>
-                <w:color w:val="000000"/>
-                <w:sz w:val="32"/>
-                <w:szCs w:val="40"/>
-                <w:lang w:val="it-IT" w:eastAsia="en-IN" w:bidi="ml-IN"/>
-              </w:rPr>
-              <w:t>–</w:t>
-            </w:r>
-            <w:r>
-              <w:rPr>
-                <w:rFonts w:ascii="BRH Malayalam Extra" w:eastAsia="Times New Roman" w:hAnsi="BRH Malayalam Extra" w:cs="BRH Malayalam Extra"/>
-                <w:color w:val="000000"/>
-                <w:sz w:val="40"/>
-                <w:szCs w:val="40"/>
-                <w:lang w:val="it-IT" w:eastAsia="en-IN" w:bidi="ml-IN"/>
-              </w:rPr>
-              <w:t>¥jx„d¡— |</w:t>
+                <w:lang w:val="en-IN" w:eastAsia="en-IN" w:bidi="ml-IN"/>
+              </w:rPr>
+              <w:t>óè</w:t>
+            </w:r>
+            <w:r>
+              <w:rPr>
+                <w:rFonts w:ascii="BRH Malayalam Extra" w:eastAsia="Times New Roman" w:hAnsi="BRH Malayalam Extra" w:cs="BRH Malayalam Extra"/>
+                <w:color w:val="000000"/>
+                <w:sz w:val="40"/>
+                <w:szCs w:val="40"/>
+                <w:lang w:val="en-IN" w:eastAsia="en-IN" w:bidi="ml-IN"/>
+              </w:rPr>
+              <w:t>—szZy</w:t>
+            </w:r>
+            <w:r>
+              <w:rPr>
+                <w:rFonts w:ascii="BRH Malayalam Extra" w:eastAsia="Times New Roman" w:hAnsi="BRH Malayalam Extra" w:cs="BRH Malayalam Extra"/>
+                <w:color w:val="000000"/>
+                <w:sz w:val="32"/>
+                <w:szCs w:val="40"/>
+                <w:lang w:val="en-IN" w:eastAsia="en-IN" w:bidi="ml-IN"/>
+              </w:rPr>
+              <w:t>–</w:t>
+            </w:r>
+            <w:r>
+              <w:rPr>
+                <w:rFonts w:ascii="BRH Malayalam Extra" w:eastAsia="Times New Roman" w:hAnsi="BRH Malayalam Extra" w:cs="BRH Malayalam Extra"/>
+                <w:color w:val="000000"/>
+                <w:sz w:val="40"/>
+                <w:szCs w:val="40"/>
+                <w:lang w:val="en-IN" w:eastAsia="en-IN" w:bidi="ml-IN"/>
+              </w:rPr>
+              <w:t xml:space="preserve"> </w:t>
+            </w:r>
+            <w:r>
+              <w:rPr>
+                <w:rFonts w:ascii="BRH Malayalam Extra" w:eastAsia="Times New Roman" w:hAnsi="BRH Malayalam Extra" w:cs="BRH Malayalam Extra"/>
+                <w:sz w:val="40"/>
+                <w:szCs w:val="40"/>
+                <w:lang w:val="en-IN" w:eastAsia="en-IN" w:bidi="ml-IN"/>
+              </w:rPr>
+              <w:t>itx</w:t>
+            </w:r>
+            <w:r>
+              <w:rPr>
+                <w:rFonts w:ascii="BRH Devanagari Extra" w:eastAsia="Times New Roman" w:hAnsi="BRH Devanagari Extra" w:cs="BRH Malayalam Extra"/>
+                <w:sz w:val="36"/>
+                <w:szCs w:val="40"/>
+                <w:lang w:val="en-IN" w:eastAsia="en-IN" w:bidi="ml-IN"/>
+              </w:rPr>
+              <w:t>óè</w:t>
+            </w:r>
+            <w:r>
+              <w:rPr>
+                <w:rFonts w:ascii="BRH Malayalam Extra" w:eastAsia="Times New Roman" w:hAnsi="BRH Malayalam Extra" w:cs="BRH Malayalam Extra"/>
+                <w:sz w:val="40"/>
+                <w:szCs w:val="40"/>
+                <w:lang w:val="en-IN" w:eastAsia="en-IN" w:bidi="ml-IN"/>
+              </w:rPr>
+              <w:t>—sy ||</w:t>
             </w:r>
           </w:p>
         </w:tc>
@@ -1895,18 +2287,78 @@
                 <w:color w:val="000000"/>
                 <w:sz w:val="40"/>
                 <w:szCs w:val="40"/>
-                <w:lang w:val="it-IT" w:eastAsia="en-IN" w:bidi="ml-IN"/>
-              </w:rPr>
-            </w:pPr>
-            <w:r>
-              <w:rPr>
-                <w:rFonts w:ascii="BRH Malayalam Extra" w:eastAsia="Times New Roman" w:hAnsi="BRH Malayalam Extra" w:cs="BRH Malayalam Extra"/>
-                <w:color w:val="000000"/>
-                <w:sz w:val="40"/>
-                <w:szCs w:val="40"/>
-                <w:lang w:val="it-IT" w:eastAsia="en-IN" w:bidi="ml-IN"/>
-              </w:rPr>
-              <w:t>CöÉ</w:t>
+                <w:lang w:val="en-IN" w:eastAsia="en-IN" w:bidi="ml-IN"/>
+              </w:rPr>
+            </w:pPr>
+            <w:r>
+              <w:rPr>
+                <w:rFonts w:ascii="BRH Malayalam Extra" w:eastAsia="Times New Roman" w:hAnsi="BRH Malayalam Extra" w:cs="BRH Malayalam Extra"/>
+                <w:color w:val="000000"/>
+                <w:sz w:val="40"/>
+                <w:szCs w:val="40"/>
+                <w:lang w:val="en-IN" w:eastAsia="en-IN" w:bidi="ml-IN"/>
+              </w:rPr>
+              <w:t>ix</w:t>
+            </w:r>
+            <w:r>
+              <w:rPr>
+                <w:rFonts w:ascii="BRH Malayalam Extra" w:eastAsia="Times New Roman" w:hAnsi="BRH Malayalam Extra" w:cs="BRH Malayalam Extra"/>
+                <w:color w:val="000000"/>
+                <w:sz w:val="32"/>
+                <w:szCs w:val="40"/>
+                <w:lang w:val="en-IN" w:eastAsia="en-IN" w:bidi="ml-IN"/>
+              </w:rPr>
+              <w:t>–</w:t>
+            </w:r>
+            <w:r>
+              <w:rPr>
+                <w:rFonts w:ascii="BRH Malayalam Extra" w:eastAsia="Times New Roman" w:hAnsi="BRH Malayalam Extra" w:cs="BRH Malayalam Extra"/>
+                <w:color w:val="000000"/>
+                <w:sz w:val="40"/>
+                <w:szCs w:val="40"/>
+                <w:lang w:val="en-IN" w:eastAsia="en-IN" w:bidi="ml-IN"/>
+              </w:rPr>
+              <w:t>i</w:t>
+            </w:r>
+            <w:r>
+              <w:rPr>
+                <w:rFonts w:ascii="BRH Malayalam Extra" w:eastAsia="Times New Roman" w:hAnsi="BRH Malayalam Extra" w:cs="BRH Malayalam Extra"/>
+                <w:color w:val="000000"/>
+                <w:sz w:val="32"/>
+                <w:szCs w:val="40"/>
+                <w:lang w:val="en-IN" w:eastAsia="en-IN" w:bidi="ml-IN"/>
+              </w:rPr>
+              <w:t>–</w:t>
+            </w:r>
+            <w:r>
+              <w:rPr>
+                <w:rFonts w:ascii="BRH Malayalam Extra" w:eastAsia="Times New Roman" w:hAnsi="BRH Malayalam Extra" w:cs="BRH Malayalam Extra"/>
+                <w:color w:val="000000"/>
+                <w:sz w:val="40"/>
+                <w:szCs w:val="40"/>
+                <w:lang w:val="en-IN" w:eastAsia="en-IN" w:bidi="ml-IN"/>
+              </w:rPr>
+              <w:t>Kxdx</w:t>
+            </w:r>
+            <w:r>
+              <w:rPr>
+                <w:rFonts w:ascii="BRH Malayalam Extra" w:eastAsia="Times New Roman" w:hAnsi="BRH Malayalam Extra" w:cs="BRH Malayalam Extra"/>
+                <w:color w:val="000000"/>
+                <w:sz w:val="32"/>
+                <w:szCs w:val="40"/>
+                <w:lang w:val="en-IN" w:eastAsia="en-IN" w:bidi="ml-IN"/>
+              </w:rPr>
+              <w:t>–</w:t>
+            </w:r>
+            <w:r>
+              <w:rPr>
+                <w:rFonts w:ascii="BRH Malayalam Extra" w:eastAsia="Times New Roman" w:hAnsi="BRH Malayalam Extra" w:cs="BRH Malayalam Extra"/>
+                <w:color w:val="000000"/>
+                <w:sz w:val="40"/>
+                <w:szCs w:val="40"/>
+                <w:lang w:val="en-IN" w:eastAsia="en-IN" w:bidi="ml-IN"/>
+              </w:rPr>
+              <w:t>I itx</w:t>
             </w:r>
             <w:r>
               <w:rPr>
@@ -1914,7 +2366,7 @@
                 <w:color w:val="000000"/>
                 <w:sz w:val="36"/>
                 <w:szCs w:val="40"/>
-                <w:lang w:val="it-IT" w:eastAsia="en-IN" w:bidi="ml-IN"/>
+                <w:lang w:val="en-IN" w:eastAsia="en-IN" w:bidi="ml-IN"/>
               </w:rPr>
               <w:t>óè</w:t>
             </w:r>
@@ -1924,9 +2376,35 @@
                 <w:color w:val="000000"/>
                 <w:sz w:val="40"/>
                 <w:szCs w:val="40"/>
-                <w:lang w:val="it-IT" w:eastAsia="en-IN" w:bidi="ml-IN"/>
-              </w:rPr>
-              <w:t>— s</w:t>
+                <w:lang w:val="en-IN" w:eastAsia="en-IN" w:bidi="ml-IN"/>
+              </w:rPr>
+              <w:t>—sy |</w:t>
+            </w:r>
+          </w:p>
+          <w:p>
+            <w:pPr>
+              <w:widowControl w:val="0"/>
+              <w:autoSpaceDE w:val="0"/>
+              <w:autoSpaceDN w:val="0"/>
+              <w:adjustRightInd w:val="0"/>
+              <w:spacing w:before="0" w:line="240" w:lineRule="auto"/>
+              <w:rPr>
+                <w:rFonts w:ascii="BRH Malayalam Extra" w:eastAsia="Times New Roman" w:hAnsi="BRH Malayalam Extra" w:cs="BRH Malayalam Extra"/>
+                <w:color w:val="000000"/>
+                <w:sz w:val="40"/>
+                <w:szCs w:val="40"/>
+                <w:lang w:eastAsia="en-IN" w:bidi="ml-IN"/>
+              </w:rPr>
+            </w:pPr>
+            <w:r>
+              <w:rPr>
+                <w:rFonts w:ascii="BRH Malayalam Extra" w:eastAsia="Times New Roman" w:hAnsi="BRH Malayalam Extra" w:cs="BRH Malayalam Extra"/>
+                <w:color w:val="000000"/>
+                <w:sz w:val="40"/>
+                <w:szCs w:val="40"/>
+                <w:lang w:val="en-IN" w:eastAsia="en-IN" w:bidi="ml-IN"/>
+              </w:rPr>
+              <w:t xml:space="preserve"> i</w:t>
             </w:r>
             <w:r>
               <w:rPr>
@@ -1935,85 +2413,108 @@
                 <w:sz w:val="40"/>
                 <w:szCs w:val="40"/>
                 <w:highlight w:val="green"/>
-                <w:lang w:val="it-IT" w:eastAsia="en-IN" w:bidi="ml-IN"/>
-              </w:rPr>
-              <w:t>Lx</w:t>
-            </w:r>
-            <w:r>
-              <w:rPr>
-                <w:rFonts w:ascii="BRH Malayalam Extra" w:eastAsia="Times New Roman" w:hAnsi="BRH Malayalam Extra" w:cs="BRH Malayalam Extra"/>
-                <w:color w:val="000000"/>
-                <w:sz w:val="40"/>
-                <w:szCs w:val="40"/>
-                <w:lang w:val="it-IT" w:eastAsia="en-IN" w:bidi="ml-IN"/>
-              </w:rPr>
-              <w:t xml:space="preserve">jJ | </w:t>
-            </w:r>
-          </w:p>
-          <w:p>
-            <w:pPr>
-              <w:widowControl w:val="0"/>
-              <w:autoSpaceDE w:val="0"/>
-              <w:autoSpaceDN w:val="0"/>
-              <w:adjustRightInd w:val="0"/>
-              <w:spacing w:before="0" w:line="240" w:lineRule="auto"/>
-              <w:rPr>
-                <w:rFonts w:ascii="BRH Malayalam Extra" w:eastAsia="Times New Roman" w:hAnsi="BRH Malayalam Extra" w:cs="BRH Malayalam Extra"/>
-                <w:color w:val="000000"/>
-                <w:sz w:val="40"/>
-                <w:szCs w:val="40"/>
-                <w:lang w:val="it-IT" w:eastAsia="en-IN" w:bidi="ml-IN"/>
-              </w:rPr>
-            </w:pPr>
-            <w:r>
-              <w:rPr>
-                <w:rFonts w:ascii="BRH Malayalam Extra" w:eastAsia="Times New Roman" w:hAnsi="BRH Malayalam Extra" w:cs="BRH Malayalam Extra"/>
-                <w:color w:val="000000"/>
-                <w:sz w:val="40"/>
-                <w:szCs w:val="40"/>
-                <w:lang w:val="it-IT" w:eastAsia="en-IN" w:bidi="ml-IN"/>
-              </w:rPr>
-              <w:t>s</w:t>
-            </w:r>
-            <w:r>
-              <w:rPr>
-                <w:rFonts w:ascii="BRH Malayalam Extra" w:eastAsia="Times New Roman" w:hAnsi="BRH Malayalam Extra" w:cs="BRH Malayalam Extra"/>
-                <w:color w:val="000000"/>
-                <w:sz w:val="32"/>
-                <w:szCs w:val="40"/>
-                <w:lang w:val="it-IT" w:eastAsia="en-IN" w:bidi="ml-IN"/>
-              </w:rPr>
-              <w:t>–</w:t>
-            </w:r>
-            <w:r>
-              <w:rPr>
-                <w:rFonts w:ascii="BRH Malayalam Extra" w:eastAsia="Times New Roman" w:hAnsi="BRH Malayalam Extra" w:cs="BRH Malayalam Extra"/>
-                <w:color w:val="000000"/>
-                <w:sz w:val="40"/>
-                <w:szCs w:val="40"/>
-                <w:lang w:val="it-IT" w:eastAsia="en-IN" w:bidi="ml-IN"/>
-              </w:rPr>
-              <w:t>Lx</w:t>
-            </w:r>
-            <w:r>
-              <w:rPr>
-                <w:rFonts w:ascii="BRH Malayalam Extra" w:eastAsia="Times New Roman" w:hAnsi="BRH Malayalam Extra" w:cs="BRH Malayalam Extra"/>
-                <w:color w:val="000000"/>
-                <w:sz w:val="32"/>
-                <w:szCs w:val="40"/>
-                <w:lang w:val="it-IT" w:eastAsia="en-IN" w:bidi="ml-IN"/>
-              </w:rPr>
-              <w:t>–</w:t>
-            </w:r>
-            <w:r>
-              <w:rPr>
-                <w:rFonts w:ascii="BRH Malayalam Extra" w:eastAsia="Times New Roman" w:hAnsi="BRH Malayalam Extra" w:cs="BRH Malayalam Extra"/>
-                <w:color w:val="000000"/>
-                <w:sz w:val="40"/>
-                <w:szCs w:val="40"/>
-                <w:lang w:val="it-IT" w:eastAsia="en-IN" w:bidi="ml-IN"/>
-              </w:rPr>
-              <w:t>¥jx„d¡— |</w:t>
+                <w:lang w:val="en-IN" w:eastAsia="en-IN" w:bidi="ml-IN"/>
+              </w:rPr>
+              <w:t>tx</w:t>
+            </w:r>
+            <w:r>
+              <w:rPr>
+                <w:rFonts w:ascii="BRH Malayalam Extra" w:eastAsia="Times New Roman" w:hAnsi="BRH Malayalam Extra" w:cs="BRH Malayalam Extra"/>
+                <w:color w:val="000000"/>
+                <w:sz w:val="32"/>
+                <w:szCs w:val="40"/>
+                <w:highlight w:val="green"/>
+                <w:lang w:val="en-IN" w:eastAsia="en-IN" w:bidi="ml-IN"/>
+              </w:rPr>
+              <w:t>–</w:t>
+            </w:r>
+            <w:r>
+              <w:rPr>
+                <w:rFonts w:ascii="BRH Devanagari Extra" w:eastAsia="Times New Roman" w:hAnsi="BRH Devanagari Extra" w:cs="BRH Malayalam Extra"/>
+                <w:color w:val="000000"/>
+                <w:sz w:val="36"/>
+                <w:szCs w:val="40"/>
+                <w:highlight w:val="green"/>
+                <w:lang w:val="en-IN" w:eastAsia="en-IN" w:bidi="ml-IN"/>
+              </w:rPr>
+              <w:t>ó</w:t>
+            </w:r>
+            <w:r>
+              <w:rPr>
+                <w:rFonts w:ascii="BRH Devanagari Extra" w:eastAsia="Times New Roman" w:hAnsi="BRH Devanagari Extra" w:cs="BRH Malayalam Extra"/>
+                <w:color w:val="000000"/>
+                <w:sz w:val="36"/>
+                <w:szCs w:val="40"/>
+                <w:lang w:val="en-IN" w:eastAsia="en-IN" w:bidi="ml-IN"/>
+              </w:rPr>
+              <w:t>è</w:t>
+            </w:r>
+            <w:r>
+              <w:rPr>
+                <w:rFonts w:ascii="BRH Malayalam Extra" w:eastAsia="Times New Roman" w:hAnsi="BRH Malayalam Extra" w:cs="BRH Malayalam Extra"/>
+                <w:color w:val="000000"/>
+                <w:sz w:val="32"/>
+                <w:szCs w:val="40"/>
+                <w:lang w:val="en-IN" w:eastAsia="en-IN" w:bidi="ml-IN"/>
+              </w:rPr>
+              <w:t>–</w:t>
+            </w:r>
+            <w:r>
+              <w:rPr>
+                <w:rFonts w:ascii="BRH Malayalam Extra" w:eastAsia="Times New Roman" w:hAnsi="BRH Malayalam Extra" w:cs="BRH Malayalam Extra"/>
+                <w:color w:val="000000"/>
+                <w:sz w:val="40"/>
+                <w:szCs w:val="40"/>
+                <w:lang w:val="en-IN" w:eastAsia="en-IN" w:bidi="ml-IN"/>
+              </w:rPr>
+              <w:t>szZy</w:t>
+            </w:r>
+            <w:r>
+              <w:rPr>
+                <w:rFonts w:ascii="BRH Malayalam Extra" w:eastAsia="Times New Roman" w:hAnsi="BRH Malayalam Extra" w:cs="BRH Malayalam Extra"/>
+                <w:color w:val="000000"/>
+                <w:sz w:val="32"/>
+                <w:szCs w:val="40"/>
+                <w:lang w:val="en-IN" w:eastAsia="en-IN" w:bidi="ml-IN"/>
+              </w:rPr>
+              <w:t>–</w:t>
+            </w:r>
+            <w:r>
+              <w:rPr>
+                <w:rFonts w:ascii="BRH Malayalam Extra" w:eastAsia="Times New Roman" w:hAnsi="BRH Malayalam Extra" w:cs="BRH Malayalam Extra"/>
+                <w:color w:val="000000"/>
+                <w:sz w:val="40"/>
+                <w:szCs w:val="40"/>
+                <w:lang w:val="en-IN" w:eastAsia="en-IN" w:bidi="ml-IN"/>
+              </w:rPr>
+              <w:t xml:space="preserve"> </w:t>
+            </w:r>
+            <w:r>
+              <w:rPr>
+                <w:rFonts w:ascii="BRH Malayalam Extra" w:eastAsia="Times New Roman" w:hAnsi="BRH Malayalam Extra" w:cs="BRH Malayalam Extra"/>
+                <w:sz w:val="40"/>
+                <w:szCs w:val="40"/>
+                <w:lang w:val="en-IN" w:eastAsia="en-IN" w:bidi="ml-IN"/>
+              </w:rPr>
+              <w:t>itx</w:t>
+            </w:r>
+            <w:r>
+              <w:rPr>
+                <w:rFonts w:ascii="BRH Devanagari Extra" w:eastAsia="Times New Roman" w:hAnsi="BRH Devanagari Extra" w:cs="BRH Malayalam Extra"/>
+                <w:sz w:val="36"/>
+                <w:szCs w:val="40"/>
+                <w:lang w:val="en-IN" w:eastAsia="en-IN" w:bidi="ml-IN"/>
+              </w:rPr>
+              <w:t>óè</w:t>
+            </w:r>
+            <w:r>
+              <w:rPr>
+                <w:rFonts w:ascii="BRH Malayalam Extra" w:eastAsia="Times New Roman" w:hAnsi="BRH Malayalam Extra" w:cs="BRH Malayalam Extra"/>
+                <w:sz w:val="40"/>
+                <w:szCs w:val="40"/>
+                <w:lang w:val="en-IN" w:eastAsia="en-IN" w:bidi="ml-IN"/>
+              </w:rPr>
+              <w:t>—sy ||</w:t>
             </w:r>
           </w:p>
         </w:tc>
@@ -2051,6 +2552,7 @@
                 <w:sz w:val="28"/>
                 <w:szCs w:val="32"/>
               </w:rPr>
+              <w:lastRenderedPageBreak/>
               <w:t>T.S.4.6.</w:t>
             </w:r>
             <w:r>
@@ -2060,25 +2562,7 @@
                 <w:sz w:val="28"/>
                 <w:szCs w:val="32"/>
               </w:rPr>
-              <w:t>6</w:t>
-            </w:r>
-            <w:r>
-              <w:rPr>
-                <w:rFonts w:cs="Arial"/>
-                <w:b/>
-                <w:sz w:val="28"/>
-                <w:szCs w:val="32"/>
-              </w:rPr>
-              <w:t>.</w:t>
-            </w:r>
-            <w:r>
-              <w:rPr>
-                <w:rFonts w:cs="Arial"/>
-                <w:b/>
-                <w:sz w:val="28"/>
-                <w:szCs w:val="32"/>
-              </w:rPr>
-              <w:t>2</w:t>
+              <w:t>4.2</w:t>
             </w:r>
             <w:r>
               <w:rPr>
@@ -2106,28 +2590,18 @@
                 <w:b/>
                 <w:sz w:val="28"/>
                 <w:szCs w:val="32"/>
-                <w:lang w:val="it-IT"/>
-              </w:rPr>
-            </w:pPr>
-            <w:r>
-              <w:rPr>
-                <w:rFonts w:cs="Arial"/>
-                <w:b/>
-                <w:sz w:val="28"/>
-                <w:szCs w:val="32"/>
-                <w:lang w:val="it-IT"/>
-              </w:rPr>
-              <w:t xml:space="preserve">Krama Vaakyam No.– </w:t>
-            </w:r>
-            <w:r>
-              <w:rPr>
-                <w:rFonts w:cs="Arial"/>
-                <w:b/>
-                <w:sz w:val="28"/>
-                <w:szCs w:val="32"/>
-                <w:lang w:val="it-IT"/>
-              </w:rPr>
-              <w:t>58</w:t>
+                <w:lang w:val="en-IN"/>
+              </w:rPr>
+            </w:pPr>
+            <w:r>
+              <w:rPr>
+                <w:rFonts w:cs="Arial"/>
+                <w:b/>
+                <w:sz w:val="28"/>
+                <w:szCs w:val="32"/>
+                <w:lang w:val="en-IN"/>
+              </w:rPr>
+              <w:t>Krama Vaakyam No.– 33</w:t>
             </w:r>
           </w:p>
           <w:p>
@@ -2139,7 +2613,7 @@
               <w:autoSpaceDE w:val="0"/>
               <w:autoSpaceDN w:val="0"/>
               <w:adjustRightInd w:val="0"/>
-              <w:spacing w:before="0" w:line="252" w:lineRule="auto"/>
+              <w:spacing w:before="0" w:line="240" w:lineRule="auto"/>
               <w:ind w:right="297"/>
               <w:rPr>
                 <w:rFonts w:cs="Arial"/>
@@ -2176,7 +2650,7 @@
                 <w:szCs w:val="32"/>
                 <w:lang w:val="it-IT"/>
               </w:rPr>
-              <w:t>28</w:t>
+              <w:t>17</w:t>
             </w:r>
           </w:p>
         </w:tc>
@@ -2207,17 +2681,17 @@
                 <w:szCs w:val="40"/>
                 <w:lang w:val="it-IT" w:eastAsia="en-IN" w:bidi="ml-IN"/>
               </w:rPr>
-              <w:t>A</w:t>
-            </w:r>
-            <w:r>
-              <w:rPr>
-                <w:rFonts w:ascii="BRH Malayalam Extra" w:eastAsia="Times New Roman" w:hAnsi="BRH Malayalam Extra" w:cs="BRH Malayalam Extra"/>
-                <w:color w:val="000000"/>
-                <w:sz w:val="32"/>
+              <w:t>CöÉ</w:t>
+            </w:r>
+            <w:r>
+              <w:rPr>
+                <w:rFonts w:ascii="BRH Devanagari Extra" w:eastAsia="Times New Roman" w:hAnsi="BRH Devanagari Extra" w:cs="BRH Malayalam Extra"/>
+                <w:color w:val="000000"/>
+                <w:sz w:val="36"/>
                 <w:szCs w:val="40"/>
                 <w:lang w:val="it-IT" w:eastAsia="en-IN" w:bidi="ml-IN"/>
               </w:rPr>
-              <w:t>–</w:t>
+              <w:t>óè</w:t>
             </w:r>
             <w:r>
               <w:rPr>
@@ -2227,7 +2701,7 @@
                 <w:szCs w:val="40"/>
                 <w:lang w:val="it-IT" w:eastAsia="en-IN" w:bidi="ml-IN"/>
               </w:rPr>
-              <w:t>hzq¢</w:t>
+              <w:t>— s</w:t>
             </w:r>
             <w:r>
               <w:rPr>
@@ -2238,29 +2712,36 @@
                 <w:highlight w:val="yellow"/>
                 <w:lang w:val="it-IT" w:eastAsia="en-IN" w:bidi="ml-IN"/>
               </w:rPr>
-              <w:t>dx—I</w:t>
-            </w:r>
-            <w:r>
-              <w:rPr>
-                <w:rFonts w:ascii="BRH Malayalam Extra" w:eastAsia="Times New Roman" w:hAnsi="BRH Malayalam Extra" w:cs="BRH Malayalam Extra"/>
-                <w:color w:val="000000"/>
-                <w:sz w:val="40"/>
+              <w:t>Lx</w:t>
+            </w:r>
+            <w:r>
+              <w:rPr>
+                <w:rFonts w:ascii="BRH Malayalam Extra" w:eastAsia="Times New Roman" w:hAnsi="BRH Malayalam Extra" w:cs="BRH Malayalam Extra"/>
+                <w:color w:val="000000"/>
+                <w:sz w:val="32"/>
                 <w:szCs w:val="40"/>
                 <w:lang w:val="it-IT" w:eastAsia="en-IN" w:bidi="ml-IN"/>
               </w:rPr>
-              <w:t xml:space="preserve"> ity</w:t>
-            </w:r>
-            <w:r>
-              <w:rPr>
-                <w:rFonts w:ascii="BRH Malayalam Extra" w:eastAsia="Times New Roman" w:hAnsi="BRH Malayalam Extra" w:cs="BRH Malayalam Extra"/>
-                <w:color w:val="000000"/>
-                <w:sz w:val="32"/>
+              <w:t>–</w:t>
+            </w:r>
+            <w:r>
+              <w:rPr>
+                <w:rFonts w:ascii="BRH Malayalam Extra" w:eastAsia="Times New Roman" w:hAnsi="BRH Malayalam Extra" w:cs="BRH Malayalam Extra"/>
+                <w:color w:val="000000"/>
+                <w:sz w:val="40"/>
                 <w:szCs w:val="40"/>
                 <w:lang w:val="it-IT" w:eastAsia="en-IN" w:bidi="ml-IN"/>
               </w:rPr>
-              <w:t>–</w:t>
-            </w:r>
-            <w:r>
+              <w:t xml:space="preserve">jJ | </w:t>
+            </w:r>
+          </w:p>
+          <w:p>
+            <w:pPr>
+              <w:widowControl w:val="0"/>
+              <w:autoSpaceDE w:val="0"/>
+              <w:autoSpaceDN w:val="0"/>
+              <w:adjustRightInd w:val="0"/>
+              <w:spacing w:before="0" w:line="240" w:lineRule="auto"/>
               <w:rPr>
                 <w:rFonts w:ascii="BRH Malayalam Extra" w:eastAsia="Times New Roman" w:hAnsi="BRH Malayalam Extra" w:cs="BRH Malayalam Extra"/>
                 <w:color w:val="000000"/>
@@ -2268,16 +2749,8 @@
                 <w:szCs w:val="40"/>
                 <w:lang w:val="it-IT" w:eastAsia="en-IN" w:bidi="ml-IN"/>
               </w:rPr>
-              <w:t xml:space="preserve">ixd˜I | </w:t>
-            </w:r>
-          </w:p>
-          <w:p>
-            <w:pPr>
-              <w:widowControl w:val="0"/>
-              <w:autoSpaceDE w:val="0"/>
-              <w:autoSpaceDN w:val="0"/>
-              <w:adjustRightInd w:val="0"/>
-              <w:spacing w:before="0" w:line="240" w:lineRule="auto"/>
+            </w:pPr>
+            <w:r>
               <w:rPr>
                 <w:rFonts w:ascii="BRH Malayalam Extra" w:eastAsia="Times New Roman" w:hAnsi="BRH Malayalam Extra" w:cs="BRH Malayalam Extra"/>
                 <w:color w:val="000000"/>
@@ -2285,56 +2758,47 @@
                 <w:szCs w:val="40"/>
                 <w:lang w:val="it-IT" w:eastAsia="en-IN" w:bidi="ml-IN"/>
               </w:rPr>
-            </w:pPr>
-            <w:r>
-              <w:rPr>
-                <w:rFonts w:ascii="BRH Malayalam Extra" w:eastAsia="Times New Roman" w:hAnsi="BRH Malayalam Extra" w:cs="BRH Malayalam Extra"/>
-                <w:color w:val="000000"/>
-                <w:sz w:val="40"/>
+              <w:t>s</w:t>
+            </w:r>
+            <w:r>
+              <w:rPr>
+                <w:rFonts w:ascii="BRH Malayalam Extra" w:eastAsia="Times New Roman" w:hAnsi="BRH Malayalam Extra" w:cs="BRH Malayalam Extra"/>
+                <w:color w:val="000000"/>
+                <w:sz w:val="32"/>
                 <w:szCs w:val="40"/>
                 <w:lang w:val="it-IT" w:eastAsia="en-IN" w:bidi="ml-IN"/>
               </w:rPr>
-              <w:t>i</w:t>
-            </w:r>
-            <w:r>
-              <w:rPr>
-                <w:rFonts w:ascii="BRH Malayalam Extra" w:eastAsia="Times New Roman" w:hAnsi="BRH Malayalam Extra" w:cs="BRH Malayalam Extra"/>
-                <w:color w:val="000000"/>
-                <w:sz w:val="32"/>
+              <w:t>–</w:t>
+            </w:r>
+            <w:r>
+              <w:rPr>
+                <w:rFonts w:ascii="BRH Malayalam Extra" w:eastAsia="Times New Roman" w:hAnsi="BRH Malayalam Extra" w:cs="BRH Malayalam Extra"/>
+                <w:color w:val="000000"/>
+                <w:sz w:val="40"/>
                 <w:szCs w:val="40"/>
                 <w:lang w:val="it-IT" w:eastAsia="en-IN" w:bidi="ml-IN"/>
               </w:rPr>
-              <w:t>–</w:t>
-            </w:r>
-            <w:r>
-              <w:rPr>
-                <w:rFonts w:ascii="BRH Malayalam Extra" w:eastAsia="Times New Roman" w:hAnsi="BRH Malayalam Extra" w:cs="BRH Malayalam Extra"/>
-                <w:color w:val="000000"/>
-                <w:sz w:val="40"/>
+              <w:t>Lx</w:t>
+            </w:r>
+            <w:r>
+              <w:rPr>
+                <w:rFonts w:ascii="BRH Malayalam Extra" w:eastAsia="Times New Roman" w:hAnsi="BRH Malayalam Extra" w:cs="BRH Malayalam Extra"/>
+                <w:color w:val="000000"/>
+                <w:sz w:val="32"/>
                 <w:szCs w:val="40"/>
                 <w:lang w:val="it-IT" w:eastAsia="en-IN" w:bidi="ml-IN"/>
               </w:rPr>
-              <w:t>ty</w:t>
-            </w:r>
-            <w:r>
-              <w:rPr>
-                <w:rFonts w:ascii="BRH Malayalam Extra" w:eastAsia="Times New Roman" w:hAnsi="BRH Malayalam Extra" w:cs="BRH Malayalam Extra"/>
-                <w:color w:val="000000"/>
-                <w:sz w:val="32"/>
+              <w:t>–</w:t>
+            </w:r>
+            <w:r>
+              <w:rPr>
+                <w:rFonts w:ascii="BRH Malayalam Extra" w:eastAsia="Times New Roman" w:hAnsi="BRH Malayalam Extra" w:cs="BRH Malayalam Extra"/>
+                <w:color w:val="000000"/>
+                <w:sz w:val="40"/>
                 <w:szCs w:val="40"/>
                 <w:lang w:val="it-IT" w:eastAsia="en-IN" w:bidi="ml-IN"/>
               </w:rPr>
-              <w:t>–</w:t>
-            </w:r>
-            <w:r>
-              <w:rPr>
-                <w:rFonts w:ascii="BRH Malayalam Extra" w:eastAsia="Times New Roman" w:hAnsi="BRH Malayalam Extra" w:cs="BRH Malayalam Extra"/>
-                <w:color w:val="000000"/>
-                <w:sz w:val="40"/>
-                <w:szCs w:val="40"/>
-                <w:lang w:val="it-IT" w:eastAsia="en-IN" w:bidi="ml-IN"/>
-              </w:rPr>
-              <w:t>ixd—I edxjZ |</w:t>
+              <w:t>¥jx„d¡— |</w:t>
             </w:r>
           </w:p>
         </w:tc>
@@ -2365,17 +2829,17 @@
                 <w:szCs w:val="40"/>
                 <w:lang w:val="it-IT" w:eastAsia="en-IN" w:bidi="ml-IN"/>
               </w:rPr>
-              <w:t>A</w:t>
-            </w:r>
-            <w:r>
-              <w:rPr>
-                <w:rFonts w:ascii="BRH Malayalam Extra" w:eastAsia="Times New Roman" w:hAnsi="BRH Malayalam Extra" w:cs="BRH Malayalam Extra"/>
-                <w:color w:val="000000"/>
-                <w:sz w:val="32"/>
+              <w:t>CöÉ</w:t>
+            </w:r>
+            <w:r>
+              <w:rPr>
+                <w:rFonts w:ascii="BRH Devanagari Extra" w:eastAsia="Times New Roman" w:hAnsi="BRH Devanagari Extra" w:cs="BRH Malayalam Extra"/>
+                <w:color w:val="000000"/>
+                <w:sz w:val="36"/>
                 <w:szCs w:val="40"/>
                 <w:lang w:val="it-IT" w:eastAsia="en-IN" w:bidi="ml-IN"/>
               </w:rPr>
-              <w:t>–</w:t>
+              <w:t>óè</w:t>
             </w:r>
             <w:r>
               <w:rPr>
@@ -2385,7 +2849,7 @@
                 <w:szCs w:val="40"/>
                 <w:lang w:val="it-IT" w:eastAsia="en-IN" w:bidi="ml-IN"/>
               </w:rPr>
-              <w:t>hz</w:t>
+              <w:t>— s</w:t>
             </w:r>
             <w:r>
               <w:rPr>
@@ -2396,6 +2860,437 @@
                 <w:highlight w:val="green"/>
                 <w:lang w:val="it-IT" w:eastAsia="en-IN" w:bidi="ml-IN"/>
               </w:rPr>
+              <w:t>Lx</w:t>
+            </w:r>
+            <w:r>
+              <w:rPr>
+                <w:rFonts w:ascii="BRH Malayalam Extra" w:eastAsia="Times New Roman" w:hAnsi="BRH Malayalam Extra" w:cs="BRH Malayalam Extra"/>
+                <w:color w:val="000000"/>
+                <w:sz w:val="40"/>
+                <w:szCs w:val="40"/>
+                <w:lang w:val="it-IT" w:eastAsia="en-IN" w:bidi="ml-IN"/>
+              </w:rPr>
+              <w:t xml:space="preserve">jJ | </w:t>
+            </w:r>
+          </w:p>
+          <w:p>
+            <w:pPr>
+              <w:widowControl w:val="0"/>
+              <w:autoSpaceDE w:val="0"/>
+              <w:autoSpaceDN w:val="0"/>
+              <w:adjustRightInd w:val="0"/>
+              <w:spacing w:before="0" w:line="240" w:lineRule="auto"/>
+              <w:rPr>
+                <w:rFonts w:ascii="BRH Malayalam Extra" w:eastAsia="Times New Roman" w:hAnsi="BRH Malayalam Extra" w:cs="BRH Malayalam Extra"/>
+                <w:color w:val="000000"/>
+                <w:sz w:val="40"/>
+                <w:szCs w:val="40"/>
+                <w:lang w:val="it-IT" w:eastAsia="en-IN" w:bidi="ml-IN"/>
+              </w:rPr>
+            </w:pPr>
+            <w:r>
+              <w:rPr>
+                <w:rFonts w:ascii="BRH Malayalam Extra" w:eastAsia="Times New Roman" w:hAnsi="BRH Malayalam Extra" w:cs="BRH Malayalam Extra"/>
+                <w:color w:val="000000"/>
+                <w:sz w:val="40"/>
+                <w:szCs w:val="40"/>
+                <w:lang w:val="it-IT" w:eastAsia="en-IN" w:bidi="ml-IN"/>
+              </w:rPr>
+              <w:t>s</w:t>
+            </w:r>
+            <w:r>
+              <w:rPr>
+                <w:rFonts w:ascii="BRH Malayalam Extra" w:eastAsia="Times New Roman" w:hAnsi="BRH Malayalam Extra" w:cs="BRH Malayalam Extra"/>
+                <w:color w:val="000000"/>
+                <w:sz w:val="32"/>
+                <w:szCs w:val="40"/>
+                <w:lang w:val="it-IT" w:eastAsia="en-IN" w:bidi="ml-IN"/>
+              </w:rPr>
+              <w:t>–</w:t>
+            </w:r>
+            <w:r>
+              <w:rPr>
+                <w:rFonts w:ascii="BRH Malayalam Extra" w:eastAsia="Times New Roman" w:hAnsi="BRH Malayalam Extra" w:cs="BRH Malayalam Extra"/>
+                <w:color w:val="000000"/>
+                <w:sz w:val="40"/>
+                <w:szCs w:val="40"/>
+                <w:lang w:val="it-IT" w:eastAsia="en-IN" w:bidi="ml-IN"/>
+              </w:rPr>
+              <w:t>Lx</w:t>
+            </w:r>
+            <w:r>
+              <w:rPr>
+                <w:rFonts w:ascii="BRH Malayalam Extra" w:eastAsia="Times New Roman" w:hAnsi="BRH Malayalam Extra" w:cs="BRH Malayalam Extra"/>
+                <w:color w:val="000000"/>
+                <w:sz w:val="32"/>
+                <w:szCs w:val="40"/>
+                <w:lang w:val="it-IT" w:eastAsia="en-IN" w:bidi="ml-IN"/>
+              </w:rPr>
+              <w:t>–</w:t>
+            </w:r>
+            <w:r>
+              <w:rPr>
+                <w:rFonts w:ascii="BRH Malayalam Extra" w:eastAsia="Times New Roman" w:hAnsi="BRH Malayalam Extra" w:cs="BRH Malayalam Extra"/>
+                <w:color w:val="000000"/>
+                <w:sz w:val="40"/>
+                <w:szCs w:val="40"/>
+                <w:lang w:val="it-IT" w:eastAsia="en-IN" w:bidi="ml-IN"/>
+              </w:rPr>
+              <w:t>¥jx„d¡— |</w:t>
+            </w:r>
+          </w:p>
+        </w:tc>
+      </w:tr>
+      <w:tr>
+        <w:trPr>
+          <w:trHeight w:val="1437"/>
+        </w:trPr>
+        <w:tc>
+          <w:tcPr>
+            <w:tcW w:w="3906" w:type="dxa"/>
+          </w:tcPr>
+          <w:p>
+            <w:pPr>
+              <w:widowControl w:val="0"/>
+              <w:tabs>
+                <w:tab w:val="left" w:pos="993"/>
+              </w:tabs>
+              <w:autoSpaceDE w:val="0"/>
+              <w:autoSpaceDN w:val="0"/>
+              <w:adjustRightInd w:val="0"/>
+              <w:spacing w:before="0" w:line="240" w:lineRule="auto"/>
+              <w:ind w:right="297"/>
+              <w:rPr>
+                <w:rFonts w:cs="Arial"/>
+                <w:b/>
+                <w:sz w:val="28"/>
+                <w:szCs w:val="32"/>
+              </w:rPr>
+            </w:pPr>
+            <w:r>
+              <w:rPr>
+                <w:rFonts w:cs="Arial"/>
+                <w:b/>
+                <w:sz w:val="28"/>
+                <w:szCs w:val="32"/>
+              </w:rPr>
+              <w:t>T.S.4.6.</w:t>
+            </w:r>
+            <w:r>
+              <w:rPr>
+                <w:rFonts w:cs="Arial"/>
+                <w:b/>
+                <w:sz w:val="28"/>
+                <w:szCs w:val="32"/>
+              </w:rPr>
+              <w:t>6.2</w:t>
+            </w:r>
+            <w:r>
+              <w:rPr>
+                <w:rFonts w:cs="Arial"/>
+                <w:b/>
+                <w:sz w:val="28"/>
+                <w:szCs w:val="32"/>
+              </w:rPr>
+              <w:t xml:space="preserve"> – Kramam</w:t>
+            </w:r>
+          </w:p>
+          <w:p>
+            <w:pPr>
+              <w:widowControl w:val="0"/>
+              <w:tabs>
+                <w:tab w:val="left" w:pos="993"/>
+              </w:tabs>
+              <w:autoSpaceDE w:val="0"/>
+              <w:autoSpaceDN w:val="0"/>
+              <w:adjustRightInd w:val="0"/>
+              <w:spacing w:before="0" w:line="240" w:lineRule="auto"/>
+              <w:ind w:right="297"/>
+              <w:rPr>
+                <w:rFonts w:cs="Arial"/>
+                <w:b/>
+                <w:sz w:val="28"/>
+                <w:szCs w:val="32"/>
+                <w:lang w:val="en-IN"/>
+              </w:rPr>
+            </w:pPr>
+            <w:r>
+              <w:rPr>
+                <w:rFonts w:cs="Arial"/>
+                <w:b/>
+                <w:sz w:val="28"/>
+                <w:szCs w:val="32"/>
+                <w:lang w:val="en-IN"/>
+              </w:rPr>
+              <w:t>Krama Vaakyam No.– 58</w:t>
+            </w:r>
+          </w:p>
+          <w:p>
+            <w:pPr>
+              <w:widowControl w:val="0"/>
+              <w:tabs>
+                <w:tab w:val="left" w:pos="993"/>
+              </w:tabs>
+              <w:autoSpaceDE w:val="0"/>
+              <w:autoSpaceDN w:val="0"/>
+              <w:adjustRightInd w:val="0"/>
+              <w:spacing w:before="0" w:line="252" w:lineRule="auto"/>
+              <w:ind w:right="297"/>
+              <w:rPr>
+                <w:rFonts w:cs="Arial"/>
+                <w:b/>
+                <w:sz w:val="28"/>
+                <w:szCs w:val="32"/>
+                <w:lang w:val="it-IT"/>
+              </w:rPr>
+            </w:pPr>
+            <w:r>
+              <w:rPr>
+                <w:rFonts w:cs="Arial"/>
+                <w:b/>
+                <w:sz w:val="28"/>
+                <w:szCs w:val="32"/>
+                <w:lang w:val="it-IT"/>
+              </w:rPr>
+              <w:t>Panchaati No</w:t>
+            </w:r>
+            <w:r>
+              <w:rPr>
+                <w:rFonts w:cs="Arial"/>
+                <w:b/>
+                <w:szCs w:val="32"/>
+                <w:lang w:val="it-IT"/>
+              </w:rPr>
+              <w:t xml:space="preserve">. - </w:t>
+            </w:r>
+            <w:r>
+              <w:rPr>
+                <w:rFonts w:cs="Arial"/>
+                <w:b/>
+                <w:sz w:val="28"/>
+                <w:szCs w:val="32"/>
+                <w:lang w:val="it-IT"/>
+              </w:rPr>
+              <w:t>28</w:t>
+            </w:r>
+          </w:p>
+        </w:tc>
+        <w:tc>
+          <w:tcPr>
+            <w:tcW w:w="5103" w:type="dxa"/>
+          </w:tcPr>
+          <w:p>
+            <w:pPr>
+              <w:widowControl w:val="0"/>
+              <w:autoSpaceDE w:val="0"/>
+              <w:autoSpaceDN w:val="0"/>
+              <w:adjustRightInd w:val="0"/>
+              <w:spacing w:before="0" w:line="240" w:lineRule="auto"/>
+              <w:rPr>
+                <w:rFonts w:ascii="BRH Malayalam Extra" w:eastAsia="Times New Roman" w:hAnsi="BRH Malayalam Extra" w:cs="BRH Malayalam Extra"/>
+                <w:color w:val="000000"/>
+                <w:sz w:val="40"/>
+                <w:szCs w:val="40"/>
+                <w:lang w:val="it-IT" w:eastAsia="en-IN" w:bidi="ml-IN"/>
+              </w:rPr>
+            </w:pPr>
+            <w:r>
+              <w:rPr>
+                <w:rFonts w:ascii="BRH Malayalam Extra" w:eastAsia="Times New Roman" w:hAnsi="BRH Malayalam Extra" w:cs="BRH Malayalam Extra"/>
+                <w:color w:val="000000"/>
+                <w:sz w:val="40"/>
+                <w:szCs w:val="40"/>
+                <w:lang w:val="it-IT" w:eastAsia="en-IN" w:bidi="ml-IN"/>
+              </w:rPr>
+              <w:t>A</w:t>
+            </w:r>
+            <w:r>
+              <w:rPr>
+                <w:rFonts w:ascii="BRH Malayalam Extra" w:eastAsia="Times New Roman" w:hAnsi="BRH Malayalam Extra" w:cs="BRH Malayalam Extra"/>
+                <w:color w:val="000000"/>
+                <w:sz w:val="32"/>
+                <w:szCs w:val="40"/>
+                <w:lang w:val="it-IT" w:eastAsia="en-IN" w:bidi="ml-IN"/>
+              </w:rPr>
+              <w:t>–</w:t>
+            </w:r>
+            <w:r>
+              <w:rPr>
+                <w:rFonts w:ascii="BRH Malayalam Extra" w:eastAsia="Times New Roman" w:hAnsi="BRH Malayalam Extra" w:cs="BRH Malayalam Extra"/>
+                <w:color w:val="000000"/>
+                <w:sz w:val="40"/>
+                <w:szCs w:val="40"/>
+                <w:lang w:val="it-IT" w:eastAsia="en-IN" w:bidi="ml-IN"/>
+              </w:rPr>
+              <w:t>hzq¢</w:t>
+            </w:r>
+            <w:r>
+              <w:rPr>
+                <w:rFonts w:ascii="BRH Malayalam Extra" w:eastAsia="Times New Roman" w:hAnsi="BRH Malayalam Extra" w:cs="BRH Malayalam Extra"/>
+                <w:color w:val="000000"/>
+                <w:sz w:val="40"/>
+                <w:szCs w:val="40"/>
+                <w:highlight w:val="yellow"/>
+                <w:lang w:val="it-IT" w:eastAsia="en-IN" w:bidi="ml-IN"/>
+              </w:rPr>
+              <w:t>dx—I</w:t>
+            </w:r>
+            <w:r>
+              <w:rPr>
+                <w:rFonts w:ascii="BRH Malayalam Extra" w:eastAsia="Times New Roman" w:hAnsi="BRH Malayalam Extra" w:cs="BRH Malayalam Extra"/>
+                <w:color w:val="000000"/>
+                <w:sz w:val="40"/>
+                <w:szCs w:val="40"/>
+                <w:lang w:val="it-IT" w:eastAsia="en-IN" w:bidi="ml-IN"/>
+              </w:rPr>
+              <w:t xml:space="preserve"> ity</w:t>
+            </w:r>
+            <w:r>
+              <w:rPr>
+                <w:rFonts w:ascii="BRH Malayalam Extra" w:eastAsia="Times New Roman" w:hAnsi="BRH Malayalam Extra" w:cs="BRH Malayalam Extra"/>
+                <w:color w:val="000000"/>
+                <w:sz w:val="32"/>
+                <w:szCs w:val="40"/>
+                <w:lang w:val="it-IT" w:eastAsia="en-IN" w:bidi="ml-IN"/>
+              </w:rPr>
+              <w:t>–</w:t>
+            </w:r>
+            <w:r>
+              <w:rPr>
+                <w:rFonts w:ascii="BRH Malayalam Extra" w:eastAsia="Times New Roman" w:hAnsi="BRH Malayalam Extra" w:cs="BRH Malayalam Extra"/>
+                <w:color w:val="000000"/>
+                <w:sz w:val="40"/>
+                <w:szCs w:val="40"/>
+                <w:lang w:val="it-IT" w:eastAsia="en-IN" w:bidi="ml-IN"/>
+              </w:rPr>
+              <w:t xml:space="preserve">ixd˜I | </w:t>
+            </w:r>
+          </w:p>
+          <w:p>
+            <w:pPr>
+              <w:widowControl w:val="0"/>
+              <w:autoSpaceDE w:val="0"/>
+              <w:autoSpaceDN w:val="0"/>
+              <w:adjustRightInd w:val="0"/>
+              <w:spacing w:before="0" w:line="240" w:lineRule="auto"/>
+              <w:rPr>
+                <w:rFonts w:ascii="BRH Malayalam Extra" w:eastAsia="Times New Roman" w:hAnsi="BRH Malayalam Extra" w:cs="BRH Malayalam Extra"/>
+                <w:color w:val="000000"/>
+                <w:sz w:val="40"/>
+                <w:szCs w:val="40"/>
+                <w:lang w:val="it-IT" w:eastAsia="en-IN" w:bidi="ml-IN"/>
+              </w:rPr>
+            </w:pPr>
+            <w:r>
+              <w:rPr>
+                <w:rFonts w:ascii="BRH Malayalam Extra" w:eastAsia="Times New Roman" w:hAnsi="BRH Malayalam Extra" w:cs="BRH Malayalam Extra"/>
+                <w:color w:val="000000"/>
+                <w:sz w:val="40"/>
+                <w:szCs w:val="40"/>
+                <w:lang w:val="it-IT" w:eastAsia="en-IN" w:bidi="ml-IN"/>
+              </w:rPr>
+              <w:t>i</w:t>
+            </w:r>
+            <w:r>
+              <w:rPr>
+                <w:rFonts w:ascii="BRH Malayalam Extra" w:eastAsia="Times New Roman" w:hAnsi="BRH Malayalam Extra" w:cs="BRH Malayalam Extra"/>
+                <w:color w:val="000000"/>
+                <w:sz w:val="32"/>
+                <w:szCs w:val="40"/>
+                <w:lang w:val="it-IT" w:eastAsia="en-IN" w:bidi="ml-IN"/>
+              </w:rPr>
+              <w:t>–</w:t>
+            </w:r>
+            <w:r>
+              <w:rPr>
+                <w:rFonts w:ascii="BRH Malayalam Extra" w:eastAsia="Times New Roman" w:hAnsi="BRH Malayalam Extra" w:cs="BRH Malayalam Extra"/>
+                <w:color w:val="000000"/>
+                <w:sz w:val="40"/>
+                <w:szCs w:val="40"/>
+                <w:lang w:val="it-IT" w:eastAsia="en-IN" w:bidi="ml-IN"/>
+              </w:rPr>
+              <w:t>ty</w:t>
+            </w:r>
+            <w:r>
+              <w:rPr>
+                <w:rFonts w:ascii="BRH Malayalam Extra" w:eastAsia="Times New Roman" w:hAnsi="BRH Malayalam Extra" w:cs="BRH Malayalam Extra"/>
+                <w:color w:val="000000"/>
+                <w:sz w:val="32"/>
+                <w:szCs w:val="40"/>
+                <w:lang w:val="it-IT" w:eastAsia="en-IN" w:bidi="ml-IN"/>
+              </w:rPr>
+              <w:t>–</w:t>
+            </w:r>
+            <w:r>
+              <w:rPr>
+                <w:rFonts w:ascii="BRH Malayalam Extra" w:eastAsia="Times New Roman" w:hAnsi="BRH Malayalam Extra" w:cs="BRH Malayalam Extra"/>
+                <w:color w:val="000000"/>
+                <w:sz w:val="40"/>
+                <w:szCs w:val="40"/>
+                <w:lang w:val="it-IT" w:eastAsia="en-IN" w:bidi="ml-IN"/>
+              </w:rPr>
+              <w:t>ixd—I edxjZ |</w:t>
+            </w:r>
+          </w:p>
+        </w:tc>
+        <w:tc>
+          <w:tcPr>
+            <w:tcW w:w="5386" w:type="dxa"/>
+          </w:tcPr>
+          <w:p>
+            <w:pPr>
+              <w:widowControl w:val="0"/>
+              <w:autoSpaceDE w:val="0"/>
+              <w:autoSpaceDN w:val="0"/>
+              <w:adjustRightInd w:val="0"/>
+              <w:spacing w:before="0" w:line="240" w:lineRule="auto"/>
+              <w:rPr>
+                <w:rFonts w:ascii="BRH Malayalam Extra" w:eastAsia="Times New Roman" w:hAnsi="BRH Malayalam Extra" w:cs="BRH Malayalam Extra"/>
+                <w:color w:val="000000"/>
+                <w:sz w:val="40"/>
+                <w:szCs w:val="40"/>
+                <w:lang w:val="en-IN" w:eastAsia="en-IN" w:bidi="ml-IN"/>
+              </w:rPr>
+            </w:pPr>
+            <w:r>
+              <w:rPr>
+                <w:rFonts w:ascii="BRH Malayalam Extra" w:eastAsia="Times New Roman" w:hAnsi="BRH Malayalam Extra" w:cs="BRH Malayalam Extra"/>
+                <w:color w:val="000000"/>
+                <w:sz w:val="40"/>
+                <w:szCs w:val="40"/>
+                <w:lang w:val="en-IN" w:eastAsia="en-IN" w:bidi="ml-IN"/>
+              </w:rPr>
+              <w:t>A</w:t>
+            </w:r>
+            <w:r>
+              <w:rPr>
+                <w:rFonts w:ascii="BRH Malayalam Extra" w:eastAsia="Times New Roman" w:hAnsi="BRH Malayalam Extra" w:cs="BRH Malayalam Extra"/>
+                <w:color w:val="000000"/>
+                <w:sz w:val="32"/>
+                <w:szCs w:val="40"/>
+                <w:lang w:val="en-IN" w:eastAsia="en-IN" w:bidi="ml-IN"/>
+              </w:rPr>
+              <w:t>–</w:t>
+            </w:r>
+            <w:r>
+              <w:rPr>
+                <w:rFonts w:ascii="BRH Malayalam Extra" w:eastAsia="Times New Roman" w:hAnsi="BRH Malayalam Extra" w:cs="BRH Malayalam Extra"/>
+                <w:color w:val="000000"/>
+                <w:sz w:val="40"/>
+                <w:szCs w:val="40"/>
+                <w:lang w:val="en-IN" w:eastAsia="en-IN" w:bidi="ml-IN"/>
+              </w:rPr>
+              <w:t>hz</w:t>
+            </w:r>
+            <w:r>
+              <w:rPr>
+                <w:rFonts w:ascii="BRH Malayalam Extra" w:eastAsia="Times New Roman" w:hAnsi="BRH Malayalam Extra" w:cs="BRH Malayalam Extra"/>
+                <w:color w:val="000000"/>
+                <w:sz w:val="40"/>
+                <w:szCs w:val="40"/>
+                <w:highlight w:val="green"/>
+                <w:lang w:val="en-IN" w:eastAsia="en-IN" w:bidi="ml-IN"/>
+              </w:rPr>
               <w:t>q¢</w:t>
             </w:r>
             <w:r>
@@ -2404,7 +3299,7 @@
                 <w:color w:val="000000"/>
                 <w:sz w:val="40"/>
                 <w:szCs w:val="40"/>
-                <w:lang w:val="it-IT" w:eastAsia="en-IN" w:bidi="ml-IN"/>
+                <w:lang w:val="en-IN" w:eastAsia="en-IN" w:bidi="ml-IN"/>
               </w:rPr>
               <w:t>—dxI ity</w:t>
             </w:r>
@@ -2414,17 +3309,17 @@
                 <w:color w:val="000000"/>
                 <w:sz w:val="32"/>
                 <w:szCs w:val="40"/>
-                <w:lang w:val="it-IT" w:eastAsia="en-IN" w:bidi="ml-IN"/>
-              </w:rPr>
-              <w:t>–</w:t>
-            </w:r>
-            <w:r>
-              <w:rPr>
-                <w:rFonts w:ascii="BRH Malayalam Extra" w:eastAsia="Times New Roman" w:hAnsi="BRH Malayalam Extra" w:cs="BRH Malayalam Extra"/>
-                <w:color w:val="000000"/>
-                <w:sz w:val="40"/>
-                <w:szCs w:val="40"/>
-                <w:lang w:val="it-IT" w:eastAsia="en-IN" w:bidi="ml-IN"/>
+                <w:lang w:val="en-IN" w:eastAsia="en-IN" w:bidi="ml-IN"/>
+              </w:rPr>
+              <w:t>–</w:t>
+            </w:r>
+            <w:r>
+              <w:rPr>
+                <w:rFonts w:ascii="BRH Malayalam Extra" w:eastAsia="Times New Roman" w:hAnsi="BRH Malayalam Extra" w:cs="BRH Malayalam Extra"/>
+                <w:color w:val="000000"/>
+                <w:sz w:val="40"/>
+                <w:szCs w:val="40"/>
+                <w:lang w:val="en-IN" w:eastAsia="en-IN" w:bidi="ml-IN"/>
               </w:rPr>
               <w:t xml:space="preserve">ixd˜I | </w:t>
             </w:r>
@@ -2530,7 +3425,6 @@
                 <w:sz w:val="28"/>
                 <w:szCs w:val="32"/>
               </w:rPr>
-              <w:lastRenderedPageBreak/>
               <w:t>T.S.4.6.</w:t>
             </w:r>
             <w:r>
@@ -2568,28 +3462,18 @@
                 <w:b/>
                 <w:sz w:val="28"/>
                 <w:szCs w:val="32"/>
-                <w:lang w:val="it-IT"/>
-              </w:rPr>
-            </w:pPr>
-            <w:r>
-              <w:rPr>
-                <w:rFonts w:cs="Arial"/>
-                <w:b/>
-                <w:sz w:val="28"/>
-                <w:szCs w:val="32"/>
-                <w:lang w:val="it-IT"/>
-              </w:rPr>
-              <w:t xml:space="preserve">Krama Vaakyam No.– </w:t>
-            </w:r>
-            <w:r>
-              <w:rPr>
-                <w:rFonts w:cs="Arial"/>
-                <w:b/>
-                <w:sz w:val="28"/>
-                <w:szCs w:val="32"/>
-                <w:lang w:val="it-IT"/>
-              </w:rPr>
-              <w:t>63</w:t>
+                <w:lang w:val="en-IN"/>
+              </w:rPr>
+            </w:pPr>
+            <w:r>
+              <w:rPr>
+                <w:rFonts w:cs="Arial"/>
+                <w:b/>
+                <w:sz w:val="28"/>
+                <w:szCs w:val="32"/>
+                <w:lang w:val="en-IN"/>
+              </w:rPr>
+              <w:t>Krama Vaakyam No.– 63</w:t>
             </w:r>
           </w:p>
           <w:p>
@@ -2638,17 +3522,7 @@
                 <w:szCs w:val="32"/>
                 <w:lang w:val="it-IT"/>
               </w:rPr>
-              <w:t>2</w:t>
-            </w:r>
-            <w:r>
-              <w:rPr>
-                <w:rFonts w:cs="Arial"/>
-                <w:b/>
-                <w:sz w:val="28"/>
-                <w:szCs w:val="32"/>
-                <w:lang w:val="it-IT"/>
-              </w:rPr>
-              <w:t>9</w:t>
+              <w:t>29</w:t>
             </w:r>
           </w:p>
         </w:tc>
@@ -2668,28 +3542,18 @@
                 <w:color w:val="000000"/>
                 <w:sz w:val="40"/>
                 <w:szCs w:val="40"/>
-                <w:lang w:val="en-IN" w:eastAsia="en-IN" w:bidi="ml-IN"/>
-              </w:rPr>
-            </w:pPr>
-            <w:r>
-              <w:rPr>
-                <w:rFonts w:ascii="BRH Malayalam Extra" w:eastAsia="Times New Roman" w:hAnsi="BRH Malayalam Extra" w:cs="BRH Malayalam Extra"/>
-                <w:color w:val="000000"/>
-                <w:sz w:val="40"/>
-                <w:szCs w:val="40"/>
-                <w:lang w:val="en-IN" w:eastAsia="en-IN" w:bidi="ml-IN"/>
-              </w:rPr>
-              <w:t>ögx</w:t>
-            </w:r>
-            <w:r>
-              <w:rPr>
-                <w:rFonts w:ascii="BRH Malayalam Extra" w:eastAsia="Times New Roman" w:hAnsi="BRH Malayalam Extra" w:cs="BRH Malayalam Extra"/>
-                <w:color w:val="000000"/>
-                <w:sz w:val="40"/>
-                <w:szCs w:val="40"/>
-                <w:lang w:val="en-IN" w:eastAsia="en-IN" w:bidi="ml-IN"/>
-              </w:rPr>
-              <w:t>Ö</w:t>
+                <w:lang w:val="it-IT" w:eastAsia="en-IN" w:bidi="ml-IN"/>
+              </w:rPr>
+            </w:pPr>
+            <w:r>
+              <w:rPr>
+                <w:rFonts w:ascii="BRH Malayalam Extra" w:eastAsia="Times New Roman" w:hAnsi="BRH Malayalam Extra" w:cs="BRH Malayalam Extra"/>
+                <w:color w:val="000000"/>
+                <w:sz w:val="40"/>
+                <w:szCs w:val="40"/>
+                <w:lang w:val="it-IT" w:eastAsia="en-IN" w:bidi="ml-IN"/>
+              </w:rPr>
+              <w:t>ögxÖ</w:t>
             </w:r>
             <w:r>
               <w:rPr>
@@ -2698,7 +3562,7 @@
                 <w:sz w:val="40"/>
                 <w:szCs w:val="40"/>
                 <w:highlight w:val="yellow"/>
-                <w:lang w:val="en-IN" w:eastAsia="en-IN" w:bidi="ml-IN"/>
+                <w:lang w:val="it-IT" w:eastAsia="en-IN" w:bidi="ml-IN"/>
               </w:rPr>
               <w:t>—dx</w:t>
             </w:r>
@@ -2708,7 +3572,7 @@
                 <w:color w:val="000000"/>
                 <w:sz w:val="40"/>
                 <w:szCs w:val="40"/>
-                <w:lang w:val="en-IN" w:eastAsia="en-IN" w:bidi="ml-IN"/>
+                <w:lang w:val="it-IT" w:eastAsia="en-IN" w:bidi="ml-IN"/>
               </w:rPr>
               <w:t>s</w:t>
             </w:r>
@@ -2718,17 +3582,17 @@
                 <w:color w:val="000000"/>
                 <w:sz w:val="32"/>
                 <w:szCs w:val="40"/>
-                <w:lang w:val="en-IN" w:eastAsia="en-IN" w:bidi="ml-IN"/>
-              </w:rPr>
-              <w:t>–</w:t>
-            </w:r>
-            <w:r>
-              <w:rPr>
-                <w:rFonts w:ascii="BRH Malayalam Extra" w:eastAsia="Times New Roman" w:hAnsi="BRH Malayalam Extra" w:cs="BRH Malayalam Extra"/>
-                <w:color w:val="000000"/>
-                <w:sz w:val="40"/>
-                <w:szCs w:val="40"/>
-                <w:lang w:val="en-IN" w:eastAsia="en-IN" w:bidi="ml-IN"/>
+                <w:lang w:val="it-IT" w:eastAsia="en-IN" w:bidi="ml-IN"/>
+              </w:rPr>
+              <w:t>–</w:t>
+            </w:r>
+            <w:r>
+              <w:rPr>
+                <w:rFonts w:ascii="BRH Malayalam Extra" w:eastAsia="Times New Roman" w:hAnsi="BRH Malayalam Extra" w:cs="BRH Malayalam Extra"/>
+                <w:color w:val="000000"/>
+                <w:sz w:val="40"/>
+                <w:szCs w:val="40"/>
+                <w:lang w:val="it-IT" w:eastAsia="en-IN" w:bidi="ml-IN"/>
               </w:rPr>
               <w:t>J eyZ—kJ |</w:t>
             </w:r>
@@ -2750,16 +3614,16 @@
                 <w:color w:val="000000"/>
                 <w:sz w:val="40"/>
                 <w:szCs w:val="40"/>
-                <w:lang w:eastAsia="en-IN" w:bidi="ml-IN"/>
-              </w:rPr>
-            </w:pPr>
-            <w:r>
-              <w:rPr>
-                <w:rFonts w:ascii="BRH Malayalam Extra" w:eastAsia="Times New Roman" w:hAnsi="BRH Malayalam Extra" w:cs="BRH Malayalam Extra"/>
-                <w:color w:val="000000"/>
-                <w:sz w:val="40"/>
-                <w:szCs w:val="40"/>
-                <w:lang w:val="en-IN" w:eastAsia="en-IN" w:bidi="ml-IN"/>
+                <w:lang w:val="it-IT" w:eastAsia="en-IN" w:bidi="ml-IN"/>
+              </w:rPr>
+            </w:pPr>
+            <w:r>
+              <w:rPr>
+                <w:rFonts w:ascii="BRH Malayalam Extra" w:eastAsia="Times New Roman" w:hAnsi="BRH Malayalam Extra" w:cs="BRH Malayalam Extra"/>
+                <w:color w:val="000000"/>
+                <w:sz w:val="40"/>
+                <w:szCs w:val="40"/>
+                <w:lang w:val="it-IT" w:eastAsia="en-IN" w:bidi="ml-IN"/>
               </w:rPr>
               <w:t>ögxÖ—</w:t>
             </w:r>
@@ -2769,6 +3633,7 @@
                 <w:sz w:val="40"/>
                 <w:szCs w:val="40"/>
                 <w:highlight w:val="green"/>
+                <w:lang w:val="it-IT"/>
               </w:rPr>
               <w:t>Y</w:t>
             </w:r>
@@ -2777,6 +3642,7 @@
                 <w:rFonts w:ascii="BRH Malayalam Extra" w:hAnsi="BRH Malayalam Extra" w:cs="BRH Malayalam Extra"/>
                 <w:sz w:val="40"/>
                 <w:szCs w:val="40"/>
+                <w:lang w:val="it-IT"/>
               </w:rPr>
               <w:t>x</w:t>
             </w:r>
@@ -2786,7 +3652,7 @@
                 <w:color w:val="000000"/>
                 <w:sz w:val="40"/>
                 <w:szCs w:val="40"/>
-                <w:lang w:val="en-IN" w:eastAsia="en-IN" w:bidi="ml-IN"/>
+                <w:lang w:val="it-IT" w:eastAsia="en-IN" w:bidi="ml-IN"/>
               </w:rPr>
               <w:t>s</w:t>
             </w:r>
@@ -2796,17 +3662,17 @@
                 <w:color w:val="000000"/>
                 <w:sz w:val="32"/>
                 <w:szCs w:val="40"/>
-                <w:lang w:val="en-IN" w:eastAsia="en-IN" w:bidi="ml-IN"/>
-              </w:rPr>
-              <w:t>–</w:t>
-            </w:r>
-            <w:r>
-              <w:rPr>
-                <w:rFonts w:ascii="BRH Malayalam Extra" w:eastAsia="Times New Roman" w:hAnsi="BRH Malayalam Extra" w:cs="BRH Malayalam Extra"/>
-                <w:color w:val="000000"/>
-                <w:sz w:val="40"/>
-                <w:szCs w:val="40"/>
-                <w:lang w:val="en-IN" w:eastAsia="en-IN" w:bidi="ml-IN"/>
+                <w:lang w:val="it-IT" w:eastAsia="en-IN" w:bidi="ml-IN"/>
+              </w:rPr>
+              <w:t>–</w:t>
+            </w:r>
+            <w:r>
+              <w:rPr>
+                <w:rFonts w:ascii="BRH Malayalam Extra" w:eastAsia="Times New Roman" w:hAnsi="BRH Malayalam Extra" w:cs="BRH Malayalam Extra"/>
+                <w:color w:val="000000"/>
+                <w:sz w:val="40"/>
+                <w:szCs w:val="40"/>
+                <w:lang w:val="it-IT" w:eastAsia="en-IN" w:bidi="ml-IN"/>
               </w:rPr>
               <w:t>J eyZ—kJ |</w:t>
             </w:r>
@@ -3861,6 +4727,7 @@
           <w:szCs w:val="32"/>
           <w:u w:val="single"/>
         </w:rPr>
+        <w:lastRenderedPageBreak/>
         <w:t xml:space="preserve">TS </w:t>
       </w:r>
       <w:r>
@@ -4307,7 +5174,6 @@
                 <w:szCs w:val="40"/>
                 <w:lang w:val="en-IN" w:eastAsia="en-IN" w:bidi="ml-IN"/>
               </w:rPr>
-              <w:lastRenderedPageBreak/>
               <w:t>¥K</w:t>
             </w:r>
             <w:r>
@@ -4455,7 +5321,6 @@
                 <w:szCs w:val="40"/>
                 <w:lang w:val="en-IN" w:eastAsia="en-IN" w:bidi="ml-IN"/>
               </w:rPr>
-              <w:lastRenderedPageBreak/>
               <w:t>¥K</w:t>
             </w:r>
             <w:r>
@@ -4554,7 +5419,6 @@
                 <w:szCs w:val="40"/>
                 <w:lang w:val="en-IN" w:eastAsia="en-IN" w:bidi="ml-IN"/>
               </w:rPr>
-              <w:lastRenderedPageBreak/>
               <w:t>¥K</w:t>
             </w:r>
             <w:r>
@@ -4696,7 +5560,6 @@
           <w:szCs w:val="32"/>
           <w:u w:val="single"/>
         </w:rPr>
-        <w:lastRenderedPageBreak/>
         <w:t>=========</w:t>
       </w:r>
     </w:p>
@@ -5726,6 +6589,7 @@
                 <w:sz w:val="28"/>
                 <w:szCs w:val="32"/>
               </w:rPr>
+              <w:lastRenderedPageBreak/>
               <w:t>T.S.4.6.5.6 – Kramam</w:t>
             </w:r>
           </w:p>
@@ -6406,7 +7270,6 @@
                 <w:sz w:val="28"/>
                 <w:szCs w:val="32"/>
               </w:rPr>
-              <w:lastRenderedPageBreak/>
               <w:t>T.S.4.6.6.7 – Kramam</w:t>
             </w:r>
           </w:p>
@@ -8112,6 +8975,7 @@
                 <w:sz w:val="28"/>
                 <w:szCs w:val="32"/>
               </w:rPr>
+              <w:lastRenderedPageBreak/>
               <w:t>T.S.4.6.8.3 – Kramam</w:t>
             </w:r>
           </w:p>
@@ -8885,7 +9749,6 @@
                 <w:sz w:val="28"/>
                 <w:szCs w:val="32"/>
               </w:rPr>
-              <w:lastRenderedPageBreak/>
               <w:t>T.S.4.6.9.1 – Kramam</w:t>
             </w:r>
           </w:p>
@@ -9439,7 +10302,16 @@
           <w:bCs/>
           <w:sz w:val="32"/>
         </w:rPr>
-        <w:t>replaced with</w:t>
+        <w:t xml:space="preserve">replaced </w:t>
+      </w:r>
+      <w:proofErr w:type="gramStart"/>
+      <w:r>
+        <w:rPr>
+          <w:b/>
+          <w:bCs/>
+          <w:sz w:val="32"/>
+        </w:rPr>
+        <w:t>with</w:t>
       </w:r>
       <w:r>
         <w:rPr>
@@ -9461,6 +10333,7 @@
         </w:rPr>
         <w:t>"</w:t>
       </w:r>
+      <w:proofErr w:type="gramEnd"/>
       <w:r>
         <w:rPr>
           <w:rFonts w:ascii="BRH Malayalam" w:hAnsi="BRH Malayalam" w:cs="BRH Malayalam"/>
@@ -9472,6 +10345,7 @@
         </w:rPr>
         <w:t>q§T</w:t>
       </w:r>
+      <w:proofErr w:type="gramStart"/>
       <w:r>
         <w:rPr>
           <w:rFonts w:ascii="BRH Malayalam" w:hAnsi="BRH Malayalam" w:cs="BRH Malayalam"/>
@@ -9488,7 +10362,16 @@
           <w:bCs/>
           <w:sz w:val="32"/>
         </w:rPr>
-        <w:t>wherever applicable</w:t>
+        <w:t>wherever</w:t>
+      </w:r>
+      <w:proofErr w:type="gramEnd"/>
+      <w:r>
+        <w:rPr>
+          <w:b/>
+          <w:bCs/>
+          <w:sz w:val="32"/>
+        </w:rPr>
+        <w:t xml:space="preserve"> applicable</w:t>
       </w:r>
     </w:p>
     <w:p>

</xml_diff>